<commit_message>
Actualicé todo el proyecto
</commit_message>
<xml_diff>
--- a/PROYECTO FINAL .docx
+++ b/PROYECTO FINAL .docx
@@ -39,7 +39,7 @@
             <mc:AlternateContent>
               <mc:Choice Requires="wps">
                 <w:drawing>
-                  <wp:anchor distT="0" distB="0" distL="114300" distR="114300" simplePos="0" relativeHeight="251664384" behindDoc="0" locked="0" layoutInCell="1" allowOverlap="1" wp14:anchorId="549BD10C" wp14:editId="4117536E">
+                  <wp:anchor distT="0" distB="0" distL="114300" distR="114300" simplePos="0" relativeHeight="251648512" behindDoc="0" locked="0" layoutInCell="1" allowOverlap="1" wp14:anchorId="549BD10C" wp14:editId="4117536E">
                     <wp:simplePos x="0" y="0"/>
                     <wp:positionH relativeFrom="column">
                       <wp:posOffset>713105</wp:posOffset>
@@ -211,7 +211,7 @@
                     <v:stroke joinstyle="miter"/>
                     <v:path gradientshapeok="t" o:connecttype="rect"/>
                   </v:shapetype>
-                  <v:shape id="Cuadro de texto 1" o:spid="_x0000_s1026" type="#_x0000_t202" style="position:absolute;margin-left:56.15pt;margin-top:417.25pt;width:343.2pt;height:156pt;z-index:251664384;visibility:visible;mso-wrap-style:square;mso-width-percent:0;mso-height-percent:0;mso-wrap-distance-left:9pt;mso-wrap-distance-top:0;mso-wrap-distance-right:9pt;mso-wrap-distance-bottom:0;mso-position-horizontal:absolute;mso-position-horizontal-relative:text;mso-position-vertical:absolute;mso-position-vertical-relative:text;mso-width-percent:0;mso-height-percent:0;mso-width-relative:margin;mso-height-relative:margin;v-text-anchor:bottom" o:gfxdata="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" filled="f" stroked="f" strokeweight=".5pt">
+                  <v:shape id="Cuadro de texto 1" o:spid="_x0000_s1026" type="#_x0000_t202" style="position:absolute;margin-left:56.15pt;margin-top:417.25pt;width:343.2pt;height:156pt;z-index:251648512;visibility:visible;mso-wrap-style:square;mso-width-percent:0;mso-height-percent:0;mso-wrap-distance-left:9pt;mso-wrap-distance-top:0;mso-wrap-distance-right:9pt;mso-wrap-distance-bottom:0;mso-position-horizontal:absolute;mso-position-horizontal-relative:text;mso-position-vertical:absolute;mso-position-vertical-relative:text;mso-width-percent:0;mso-height-percent:0;mso-width-relative:margin;mso-height-relative:margin;v-text-anchor:bottom" o:gfxdata="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" filled="f" stroked="f" strokeweight=".5pt">
                     <v:textbox inset="0,0,0,0">
                       <w:txbxContent>
                         <w:p>
@@ -326,7 +326,7 @@
               <w:noProof/>
             </w:rPr>
             <w:drawing>
-              <wp:anchor distT="0" distB="0" distL="114300" distR="114300" simplePos="0" relativeHeight="251665408" behindDoc="1" locked="0" layoutInCell="1" allowOverlap="1" wp14:anchorId="4306AF1E" wp14:editId="494251B4">
+              <wp:anchor distT="0" distB="0" distL="114300" distR="114300" simplePos="0" relativeHeight="251649536" behindDoc="1" locked="0" layoutInCell="1" allowOverlap="1" wp14:anchorId="4306AF1E" wp14:editId="494251B4">
                 <wp:simplePos x="0" y="0"/>
                 <wp:positionH relativeFrom="column">
                   <wp:posOffset>2195195</wp:posOffset>
@@ -410,7 +410,7 @@
             <mc:AlternateContent>
               <mc:Choice Requires="wps">
                 <w:drawing>
-                  <wp:anchor distT="0" distB="0" distL="114300" distR="114300" simplePos="0" relativeHeight="251660288" behindDoc="0" locked="0" layoutInCell="1" allowOverlap="1" wp14:anchorId="75DCDFF8" wp14:editId="2028C836">
+                  <wp:anchor distT="0" distB="0" distL="114300" distR="114300" simplePos="0" relativeHeight="251645440" behindDoc="0" locked="0" layoutInCell="1" allowOverlap="1" wp14:anchorId="75DCDFF8" wp14:editId="2028C836">
                     <wp:simplePos x="0" y="0"/>
                     <wp:positionH relativeFrom="margin">
                       <wp:align>right</wp:align>
@@ -516,7 +516,7 @@
               </mc:Choice>
               <mc:Fallback>
                 <w:pict>
-                  <v:shape w14:anchorId="75DCDFF8" id="Cuadro de texto 113" o:spid="_x0000_s1027" type="#_x0000_t202" style="position:absolute;margin-left:403.3pt;margin-top:330.65pt;width:454.5pt;height:78.9pt;z-index:251660288;visibility:visible;mso-wrap-style:square;mso-width-percent:0;mso-height-percent:0;mso-wrap-distance-left:9pt;mso-wrap-distance-top:0;mso-wrap-distance-right:9pt;mso-wrap-distance-bottom:0;mso-position-horizontal:right;mso-position-horizontal-relative:margin;mso-position-vertical:absolute;mso-position-vertical-relative:margin;mso-width-percent:0;mso-height-percent:0;mso-width-relative:page;mso-height-relative:page;v-text-anchor:bottom" o:gfxdata="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" filled="f" stroked="f" strokeweight=".5pt">
+                  <v:shape w14:anchorId="75DCDFF8" id="Cuadro de texto 113" o:spid="_x0000_s1027" type="#_x0000_t202" style="position:absolute;margin-left:403.3pt;margin-top:330.65pt;width:454.5pt;height:78.9pt;z-index:251645440;visibility:visible;mso-wrap-style:square;mso-width-percent:0;mso-height-percent:0;mso-wrap-distance-left:9pt;mso-wrap-distance-top:0;mso-wrap-distance-right:9pt;mso-wrap-distance-bottom:0;mso-position-horizontal:right;mso-position-horizontal-relative:margin;mso-position-vertical:absolute;mso-position-vertical-relative:margin;mso-width-percent:0;mso-height-percent:0;mso-width-relative:page;mso-height-relative:page;v-text-anchor:bottom" o:gfxdata="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" filled="f" stroked="f" strokeweight=".5pt">
                     <v:textbox inset="0,0,0,0">
                       <w:txbxContent>
                         <w:p>
@@ -571,7 +571,7 @@
             <mc:AlternateContent>
               <mc:Choice Requires="wpg">
                 <w:drawing>
-                  <wp:anchor distT="0" distB="0" distL="114300" distR="114300" simplePos="0" relativeHeight="251659264" behindDoc="0" locked="0" layoutInCell="1" allowOverlap="1" wp14:anchorId="675FB39A" wp14:editId="1BA855FC">
+                  <wp:anchor distT="0" distB="0" distL="114300" distR="114300" simplePos="0" relativeHeight="251644416" behindDoc="0" locked="0" layoutInCell="1" allowOverlap="1" wp14:anchorId="675FB39A" wp14:editId="1BA855FC">
                     <wp:simplePos x="0" y="0"/>
                     <wp:positionH relativeFrom="margin">
                       <wp:posOffset>160020</wp:posOffset>
@@ -716,7 +716,7 @@
             <mc:AlternateContent>
               <mc:Choice Requires="wps">
                 <w:drawing>
-                  <wp:anchor distT="0" distB="0" distL="114300" distR="114300" simplePos="0" relativeHeight="251661312" behindDoc="0" locked="0" layoutInCell="1" allowOverlap="1" wp14:anchorId="045BD464" wp14:editId="54A6CC92">
+                  <wp:anchor distT="0" distB="0" distL="114300" distR="114300" simplePos="0" relativeHeight="251646464" behindDoc="0" locked="0" layoutInCell="1" allowOverlap="1" wp14:anchorId="045BD464" wp14:editId="54A6CC92">
                     <wp:simplePos x="0" y="0"/>
                     <wp:positionH relativeFrom="margin">
                       <wp:align>right</wp:align>
@@ -883,7 +883,7 @@
               </mc:Choice>
               <mc:Fallback>
                 <w:pict>
-                  <v:shape w14:anchorId="045BD464" id="Cuadro de texto 112" o:spid="_x0000_s1028" type="#_x0000_t202" style="position:absolute;margin-left:401.8pt;margin-top:0;width:453pt;height:111.6pt;z-index:251661312;visibility:visible;mso-wrap-style:square;mso-width-percent:734;mso-height-percent:0;mso-wrap-distance-left:9pt;mso-wrap-distance-top:0;mso-wrap-distance-right:9pt;mso-wrap-distance-bottom:0;mso-position-horizontal:right;mso-position-horizontal-relative:margin;mso-position-vertical:bottom;mso-position-vertical-relative:margin;mso-width-percent:734;mso-height-percent:0;mso-width-relative:page;mso-height-relative:page;v-text-anchor:bottom" o:gfxdata="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" filled="f" stroked="f" strokeweight=".5pt">
+                  <v:shape w14:anchorId="045BD464" id="Cuadro de texto 112" o:spid="_x0000_s1028" type="#_x0000_t202" style="position:absolute;margin-left:401.8pt;margin-top:0;width:453pt;height:111.6pt;z-index:251646464;visibility:visible;mso-wrap-style:square;mso-width-percent:734;mso-height-percent:0;mso-wrap-distance-left:9pt;mso-wrap-distance-top:0;mso-wrap-distance-right:9pt;mso-wrap-distance-bottom:0;mso-position-horizontal:right;mso-position-horizontal-relative:margin;mso-position-vertical:bottom;mso-position-vertical-relative:margin;mso-width-percent:734;mso-height-percent:0;mso-width-relative:page;mso-height-relative:page;v-text-anchor:bottom" o:gfxdata="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" filled="f" stroked="f" strokeweight=".5pt">
                     <v:textbox inset="0,0,0,0">
                       <w:txbxContent>
                         <w:p>
@@ -999,7 +999,7 @@
             <mc:AlternateContent>
               <mc:Choice Requires="wps">
                 <w:drawing>
-                  <wp:anchor distT="0" distB="0" distL="114300" distR="114300" simplePos="0" relativeHeight="251662336" behindDoc="0" locked="0" layoutInCell="1" allowOverlap="1" wp14:anchorId="6738C990" wp14:editId="1281FDD6">
+                  <wp:anchor distT="0" distB="0" distL="114300" distR="114300" simplePos="0" relativeHeight="251647488" behindDoc="0" locked="0" layoutInCell="1" allowOverlap="1" wp14:anchorId="6738C990" wp14:editId="1281FDD6">
                     <wp:simplePos x="0" y="0"/>
                     <mc:AlternateContent>
                       <mc:Choice Requires="wp14">
@@ -1129,7 +1129,7 @@
               </mc:Choice>
               <mc:Fallback>
                 <w:pict>
-                  <v:shape w14:anchorId="6738C990" id="Cuadro de texto 111" o:spid="_x0000_s1029" type="#_x0000_t202" style="position:absolute;margin-left:0;margin-top:0;width:288.25pt;height:287.5pt;z-index:251662336;visibility:visible;mso-wrap-style:square;mso-width-percent:734;mso-height-percent:363;mso-left-percent:150;mso-top-percent:91;mso-wrap-distance-left:9pt;mso-wrap-distance-top:0;mso-wrap-distance-right:9pt;mso-wrap-distance-bottom:0;mso-position-horizontal-relative:page;mso-position-vertical-relative:page;mso-width-percent:734;mso-height-percent:363;mso-left-percent:150;mso-top-percent:91;mso-width-relative:page;mso-height-relative:page;v-text-anchor:bottom" o:gfxdata="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" filled="f" stroked="f" strokeweight=".5pt">
+                  <v:shape w14:anchorId="6738C990" id="Cuadro de texto 111" o:spid="_x0000_s1029" type="#_x0000_t202" style="position:absolute;margin-left:0;margin-top:0;width:288.25pt;height:287.5pt;z-index:251647488;visibility:visible;mso-wrap-style:square;mso-width-percent:734;mso-height-percent:363;mso-left-percent:150;mso-top-percent:91;mso-wrap-distance-left:9pt;mso-wrap-distance-top:0;mso-wrap-distance-right:9pt;mso-wrap-distance-bottom:0;mso-position-horizontal-relative:page;mso-position-vertical-relative:page;mso-width-percent:734;mso-height-percent:363;mso-left-percent:150;mso-top-percent:91;mso-width-relative:page;mso-height-relative:page;v-text-anchor:bottom" o:gfxdata="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" filled="f" stroked="f" strokeweight=".5pt">
                     <v:textbox style="mso-fit-shape-to-text:t" inset="0,0,0,0">
                       <w:txbxContent>
                         <w:sdt>
@@ -1596,12 +1596,6 @@
     <w:p/>
     <w:p/>
     <w:p/>
-    <w:p>
-      <w:r>
-        <w:lastRenderedPageBreak/>
-        <w:t xml:space="preserve"> </w:t>
-      </w:r>
-    </w:p>
     <w:p>
       <w:pPr>
         <w:pStyle w:val="Citadestacada"/>
@@ -2419,7 +2413,7 @@
           <w:noProof/>
         </w:rPr>
         <w:drawing>
-          <wp:anchor distT="0" distB="0" distL="114300" distR="114300" simplePos="0" relativeHeight="251666432" behindDoc="0" locked="0" layoutInCell="1" allowOverlap="1" wp14:anchorId="5130BBAF" wp14:editId="6D55C52E">
+          <wp:anchor distT="0" distB="0" distL="114300" distR="114300" simplePos="0" relativeHeight="251650560" behindDoc="0" locked="0" layoutInCell="1" allowOverlap="1" wp14:anchorId="5130BBAF" wp14:editId="6D55C52E">
             <wp:simplePos x="0" y="0"/>
             <wp:positionH relativeFrom="column">
               <wp:posOffset>345440</wp:posOffset>
@@ -2522,7 +2516,7 @@
         <mc:AlternateContent>
           <mc:Choice Requires="wps">
             <w:drawing>
-              <wp:anchor distT="0" distB="0" distL="114300" distR="114300" simplePos="0" relativeHeight="251674624" behindDoc="0" locked="0" layoutInCell="1" allowOverlap="1" wp14:anchorId="5912EDA7" wp14:editId="02BC5545">
+              <wp:anchor distT="0" distB="0" distL="114300" distR="114300" simplePos="0" relativeHeight="251659776" behindDoc="0" locked="0" layoutInCell="1" allowOverlap="1" wp14:anchorId="5912EDA7" wp14:editId="02BC5545">
                 <wp:simplePos x="0" y="0"/>
                 <wp:positionH relativeFrom="column">
                   <wp:posOffset>3560445</wp:posOffset>
@@ -2748,7 +2742,7 @@
           </mc:Choice>
           <mc:Fallback>
             <w:pict>
-              <v:shape w14:anchorId="5912EDA7" id="Cuadro de texto 10" o:spid="_x0000_s1030" type="#_x0000_t202" style="position:absolute;left:0;text-align:left;margin-left:280.35pt;margin-top:.4pt;width:236.2pt;height:111.45pt;z-index:251674624;visibility:visible;mso-wrap-style:square;mso-width-percent:0;mso-height-percent:0;mso-wrap-distance-left:9pt;mso-wrap-distance-top:0;mso-wrap-distance-right:9pt;mso-wrap-distance-bottom:0;mso-position-horizontal:absolute;mso-position-horizontal-relative:text;mso-position-vertical:absolute;mso-position-vertical-relative:text;mso-width-percent:0;mso-height-percent:0;mso-width-relative:margin;mso-height-relative:margin;v-text-anchor:top" o:gfxdata="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" fillcolor="white [3201]" stroked="f" strokeweight=".5pt">
+              <v:shape w14:anchorId="5912EDA7" id="Cuadro de texto 10" o:spid="_x0000_s1030" type="#_x0000_t202" style="position:absolute;left:0;text-align:left;margin-left:280.35pt;margin-top:.4pt;width:236.2pt;height:111.45pt;z-index:251659776;visibility:visible;mso-wrap-style:square;mso-width-percent:0;mso-height-percent:0;mso-wrap-distance-left:9pt;mso-wrap-distance-top:0;mso-wrap-distance-right:9pt;mso-wrap-distance-bottom:0;mso-position-horizontal:absolute;mso-position-horizontal-relative:text;mso-position-vertical:absolute;mso-position-vertical-relative:text;mso-width-percent:0;mso-height-percent:0;mso-width-relative:margin;mso-height-relative:margin;v-text-anchor:top" o:gfxdata="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" fillcolor="white [3201]" stroked="f" strokeweight=".5pt">
                 <v:textbox>
                   <w:txbxContent>
                     <w:p>
@@ -3032,7 +3026,7 @@
           <w:noProof/>
         </w:rPr>
         <w:drawing>
-          <wp:anchor distT="0" distB="0" distL="114300" distR="114300" simplePos="0" relativeHeight="251667456" behindDoc="0" locked="0" layoutInCell="1" allowOverlap="1" wp14:anchorId="5854C8EA" wp14:editId="265145FA">
+          <wp:anchor distT="0" distB="0" distL="114300" distR="114300" simplePos="0" relativeHeight="251651584" behindDoc="0" locked="0" layoutInCell="1" allowOverlap="1" wp14:anchorId="5854C8EA" wp14:editId="265145FA">
             <wp:simplePos x="0" y="0"/>
             <wp:positionH relativeFrom="column">
               <wp:posOffset>349250</wp:posOffset>
@@ -3123,7 +3117,7 @@
         <mc:AlternateContent>
           <mc:Choice Requires="wps">
             <w:drawing>
-              <wp:anchor distT="0" distB="0" distL="114300" distR="114300" simplePos="0" relativeHeight="251676672" behindDoc="0" locked="0" layoutInCell="1" allowOverlap="1" wp14:anchorId="721B2631" wp14:editId="064E5E1B">
+              <wp:anchor distT="0" distB="0" distL="114300" distR="114300" simplePos="0" relativeHeight="251660800" behindDoc="0" locked="0" layoutInCell="1" allowOverlap="1" wp14:anchorId="721B2631" wp14:editId="064E5E1B">
                 <wp:simplePos x="0" y="0"/>
                 <wp:positionH relativeFrom="column">
                   <wp:posOffset>3609340</wp:posOffset>
@@ -3375,7 +3369,7 @@
           </mc:Choice>
           <mc:Fallback>
             <w:pict>
-              <v:shape w14:anchorId="721B2631" id="_x0000_s1031" type="#_x0000_t202" style="position:absolute;left:0;text-align:left;margin-left:284.2pt;margin-top:9.25pt;width:236.2pt;height:113.15pt;z-index:251676672;visibility:visible;mso-wrap-style:square;mso-width-percent:0;mso-height-percent:0;mso-wrap-distance-left:9pt;mso-wrap-distance-top:0;mso-wrap-distance-right:9pt;mso-wrap-distance-bottom:0;mso-position-horizontal:absolute;mso-position-horizontal-relative:text;mso-position-vertical:absolute;mso-position-vertical-relative:text;mso-width-percent:0;mso-height-percent:0;mso-width-relative:margin;mso-height-relative:margin;v-text-anchor:top" o:gfxdata="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" fillcolor="white [3201]" stroked="f" strokeweight=".5pt">
+              <v:shape w14:anchorId="721B2631" id="_x0000_s1031" type="#_x0000_t202" style="position:absolute;left:0;text-align:left;margin-left:284.2pt;margin-top:9.25pt;width:236.2pt;height:113.15pt;z-index:251660800;visibility:visible;mso-wrap-style:square;mso-width-percent:0;mso-height-percent:0;mso-wrap-distance-left:9pt;mso-wrap-distance-top:0;mso-wrap-distance-right:9pt;mso-wrap-distance-bottom:0;mso-position-horizontal:absolute;mso-position-horizontal-relative:text;mso-position-vertical:absolute;mso-position-vertical-relative:text;mso-width-percent:0;mso-height-percent:0;mso-width-relative:margin;mso-height-relative:margin;v-text-anchor:top" o:gfxdata="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" fillcolor="white [3201]" stroked="f" strokeweight=".5pt">
                 <v:textbox>
                   <w:txbxContent>
                     <w:p>
@@ -3687,7 +3681,7 @@
           <w:noProof/>
         </w:rPr>
         <w:drawing>
-          <wp:anchor distT="0" distB="0" distL="114300" distR="114300" simplePos="0" relativeHeight="251669504" behindDoc="0" locked="0" layoutInCell="1" allowOverlap="1" wp14:anchorId="7FCC755D" wp14:editId="2FF75E1B">
+          <wp:anchor distT="0" distB="0" distL="114300" distR="114300" simplePos="0" relativeHeight="251654656" behindDoc="0" locked="0" layoutInCell="1" allowOverlap="1" wp14:anchorId="7FCC755D" wp14:editId="2879D60B">
             <wp:simplePos x="0" y="0"/>
             <wp:positionH relativeFrom="column">
               <wp:posOffset>368935</wp:posOffset>
@@ -3781,7 +3775,7 @@
         <mc:AlternateContent>
           <mc:Choice Requires="wps">
             <w:drawing>
-              <wp:anchor distT="0" distB="0" distL="114300" distR="114300" simplePos="0" relativeHeight="251680768" behindDoc="0" locked="0" layoutInCell="1" allowOverlap="1" wp14:anchorId="418575F6" wp14:editId="0131CC14">
+              <wp:anchor distT="0" distB="0" distL="114300" distR="114300" simplePos="0" relativeHeight="251662848" behindDoc="0" locked="0" layoutInCell="1" allowOverlap="1" wp14:anchorId="418575F6" wp14:editId="0131CC14">
                 <wp:simplePos x="0" y="0"/>
                 <wp:positionH relativeFrom="column">
                   <wp:posOffset>3532596</wp:posOffset>
@@ -3927,7 +3921,7 @@
           </mc:Choice>
           <mc:Fallback>
             <w:pict>
-              <v:shape w14:anchorId="418575F6" id="_x0000_s1032" type="#_x0000_t202" style="position:absolute;left:0;text-align:left;margin-left:278.15pt;margin-top:.25pt;width:255.8pt;height:137.55pt;z-index:251680768;visibility:visible;mso-wrap-style:square;mso-width-percent:0;mso-height-percent:0;mso-wrap-distance-left:9pt;mso-wrap-distance-top:0;mso-wrap-distance-right:9pt;mso-wrap-distance-bottom:0;mso-position-horizontal:absolute;mso-position-horizontal-relative:text;mso-position-vertical:absolute;mso-position-vertical-relative:text;mso-width-percent:0;mso-height-percent:0;mso-width-relative:margin;mso-height-relative:margin;v-text-anchor:top" o:gfxdata="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" fillcolor="white [3201]" stroked="f" strokeweight=".5pt">
+              <v:shape w14:anchorId="418575F6" id="_x0000_s1032" type="#_x0000_t202" style="position:absolute;left:0;text-align:left;margin-left:278.15pt;margin-top:.25pt;width:255.8pt;height:137.55pt;z-index:251662848;visibility:visible;mso-wrap-style:square;mso-width-percent:0;mso-height-percent:0;mso-wrap-distance-left:9pt;mso-wrap-distance-top:0;mso-wrap-distance-right:9pt;mso-wrap-distance-bottom:0;mso-position-horizontal:absolute;mso-position-horizontal-relative:text;mso-position-vertical:absolute;mso-position-vertical-relative:text;mso-width-percent:0;mso-height-percent:0;mso-width-relative:margin;mso-height-relative:margin;v-text-anchor:top" o:gfxdata="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" fillcolor="white [3201]" stroked="f" strokeweight=".5pt">
                 <v:textbox>
                   <w:txbxContent>
                     <w:p>
@@ -4150,9 +4144,8 @@
           <w:bCs/>
           <w:noProof/>
         </w:rPr>
-        <w:lastRenderedPageBreak/>
         <w:drawing>
-          <wp:anchor distT="0" distB="0" distL="114300" distR="114300" simplePos="0" relativeHeight="251668480" behindDoc="0" locked="0" layoutInCell="1" allowOverlap="1" wp14:anchorId="43438C9A" wp14:editId="07794D93">
+          <wp:anchor distT="0" distB="0" distL="114300" distR="114300" simplePos="0" relativeHeight="251652608" behindDoc="0" locked="0" layoutInCell="1" allowOverlap="1" wp14:anchorId="43438C9A" wp14:editId="07794D93">
             <wp:simplePos x="0" y="0"/>
             <wp:positionH relativeFrom="column">
               <wp:posOffset>321945</wp:posOffset>
@@ -4255,7 +4248,7 @@
         <mc:AlternateContent>
           <mc:Choice Requires="wps">
             <w:drawing>
-              <wp:anchor distT="0" distB="0" distL="114300" distR="114300" simplePos="0" relativeHeight="251678720" behindDoc="0" locked="0" layoutInCell="1" allowOverlap="1" wp14:anchorId="578526B2" wp14:editId="359FB6B8">
+              <wp:anchor distT="0" distB="0" distL="114300" distR="114300" simplePos="0" relativeHeight="251661824" behindDoc="0" locked="0" layoutInCell="1" allowOverlap="1" wp14:anchorId="578526B2" wp14:editId="359FB6B8">
                 <wp:simplePos x="0" y="0"/>
                 <wp:positionH relativeFrom="column">
                   <wp:posOffset>3598545</wp:posOffset>
@@ -4446,7 +4439,7 @@
           </mc:Choice>
           <mc:Fallback>
             <w:pict>
-              <v:shape w14:anchorId="578526B2" id="_x0000_s1033" type="#_x0000_t202" style="position:absolute;left:0;text-align:left;margin-left:283.35pt;margin-top:6.6pt;width:236.2pt;height:153pt;z-index:251678720;visibility:visible;mso-wrap-style:square;mso-width-percent:0;mso-height-percent:0;mso-wrap-distance-left:9pt;mso-wrap-distance-top:0;mso-wrap-distance-right:9pt;mso-wrap-distance-bottom:0;mso-position-horizontal:absolute;mso-position-horizontal-relative:text;mso-position-vertical:absolute;mso-position-vertical-relative:text;mso-width-percent:0;mso-height-percent:0;mso-width-relative:margin;mso-height-relative:margin;v-text-anchor:top" o:gfxdata="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" fillcolor="white [3201]" stroked="f" strokeweight=".5pt">
+              <v:shape w14:anchorId="578526B2" id="_x0000_s1033" type="#_x0000_t202" style="position:absolute;left:0;text-align:left;margin-left:283.35pt;margin-top:6.6pt;width:236.2pt;height:153pt;z-index:251661824;visibility:visible;mso-wrap-style:square;mso-width-percent:0;mso-height-percent:0;mso-wrap-distance-left:9pt;mso-wrap-distance-top:0;mso-wrap-distance-right:9pt;mso-wrap-distance-bottom:0;mso-position-horizontal:absolute;mso-position-horizontal-relative:text;mso-position-vertical:absolute;mso-position-vertical-relative:text;mso-width-percent:0;mso-height-percent:0;mso-width-relative:margin;mso-height-relative:margin;v-text-anchor:top" o:gfxdata="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" fillcolor="white [3201]" stroked="f" strokeweight=".5pt">
                 <v:textbox>
                   <w:txbxContent>
                     <w:p>
@@ -4742,7 +4735,7 @@
           <w:noProof/>
         </w:rPr>
         <w:drawing>
-          <wp:anchor distT="0" distB="0" distL="114300" distR="114300" simplePos="0" relativeHeight="251670528" behindDoc="0" locked="0" layoutInCell="1" allowOverlap="1" wp14:anchorId="420B1657" wp14:editId="598A76AB">
+          <wp:anchor distT="0" distB="0" distL="114300" distR="114300" simplePos="0" relativeHeight="251655680" behindDoc="0" locked="0" layoutInCell="1" allowOverlap="1" wp14:anchorId="420B1657" wp14:editId="0035BBFF">
             <wp:simplePos x="0" y="0"/>
             <wp:positionH relativeFrom="margin">
               <wp:posOffset>334645</wp:posOffset>
@@ -4836,7 +4829,7 @@
         <mc:AlternateContent>
           <mc:Choice Requires="wps">
             <w:drawing>
-              <wp:anchor distT="0" distB="0" distL="114300" distR="114300" simplePos="0" relativeHeight="251682816" behindDoc="0" locked="0" layoutInCell="1" allowOverlap="1" wp14:anchorId="2C1C2456" wp14:editId="317AE75F">
+              <wp:anchor distT="0" distB="0" distL="114300" distR="114300" simplePos="0" relativeHeight="251663872" behindDoc="0" locked="0" layoutInCell="1" allowOverlap="1" wp14:anchorId="2C1C2456" wp14:editId="317AE75F">
                 <wp:simplePos x="0" y="0"/>
                 <wp:positionH relativeFrom="column">
                   <wp:posOffset>3484245</wp:posOffset>
@@ -4991,7 +4984,7 @@
           </mc:Choice>
           <mc:Fallback>
             <w:pict>
-              <v:shape w14:anchorId="2C1C2456" id="_x0000_s1034" type="#_x0000_t202" style="position:absolute;left:0;text-align:left;margin-left:274.35pt;margin-top:4.8pt;width:255.8pt;height:126.2pt;z-index:251682816;visibility:visible;mso-wrap-style:square;mso-width-percent:0;mso-height-percent:0;mso-wrap-distance-left:9pt;mso-wrap-distance-top:0;mso-wrap-distance-right:9pt;mso-wrap-distance-bottom:0;mso-position-horizontal:absolute;mso-position-horizontal-relative:text;mso-position-vertical:absolute;mso-position-vertical-relative:text;mso-width-percent:0;mso-height-percent:0;mso-width-relative:margin;mso-height-relative:margin;v-text-anchor:top" o:gfxdata="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" fillcolor="white [3201]" stroked="f" strokeweight=".5pt">
+              <v:shape w14:anchorId="2C1C2456" id="_x0000_s1034" type="#_x0000_t202" style="position:absolute;left:0;text-align:left;margin-left:274.35pt;margin-top:4.8pt;width:255.8pt;height:126.2pt;z-index:251663872;visibility:visible;mso-wrap-style:square;mso-width-percent:0;mso-height-percent:0;mso-wrap-distance-left:9pt;mso-wrap-distance-top:0;mso-wrap-distance-right:9pt;mso-wrap-distance-bottom:0;mso-position-horizontal:absolute;mso-position-horizontal-relative:text;mso-position-vertical:absolute;mso-position-vertical-relative:text;mso-width-percent:0;mso-height-percent:0;mso-width-relative:margin;mso-height-relative:margin;v-text-anchor:top" o:gfxdata="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" fillcolor="white [3201]" stroked="f" strokeweight=".5pt">
                 <v:textbox>
                   <w:txbxContent>
                     <w:p>
@@ -5232,7 +5225,7 @@
           <w:noProof/>
         </w:rPr>
         <w:drawing>
-          <wp:anchor distT="0" distB="0" distL="114300" distR="114300" simplePos="0" relativeHeight="251671552" behindDoc="0" locked="0" layoutInCell="1" allowOverlap="1" wp14:anchorId="73D407D3" wp14:editId="0D38DD32">
+          <wp:anchor distT="0" distB="0" distL="114300" distR="114300" simplePos="0" relativeHeight="251656704" behindDoc="0" locked="0" layoutInCell="1" allowOverlap="1" wp14:anchorId="73D407D3" wp14:editId="5BC719CD">
             <wp:simplePos x="0" y="0"/>
             <wp:positionH relativeFrom="column">
               <wp:posOffset>375285</wp:posOffset>
@@ -5310,7 +5303,7 @@
         <mc:AlternateContent>
           <mc:Choice Requires="wps">
             <w:drawing>
-              <wp:anchor distT="0" distB="0" distL="114300" distR="114300" simplePos="0" relativeHeight="251684864" behindDoc="0" locked="0" layoutInCell="1" allowOverlap="1" wp14:anchorId="05739663" wp14:editId="00A1DF9D">
+              <wp:anchor distT="0" distB="0" distL="114300" distR="114300" simplePos="0" relativeHeight="251664896" behindDoc="0" locked="0" layoutInCell="1" allowOverlap="1" wp14:anchorId="05739663" wp14:editId="00A1DF9D">
                 <wp:simplePos x="0" y="0"/>
                 <wp:positionH relativeFrom="column">
                   <wp:posOffset>3476625</wp:posOffset>
@@ -5456,7 +5449,7 @@
           </mc:Choice>
           <mc:Fallback>
             <w:pict>
-              <v:shape w14:anchorId="05739663" id="_x0000_s1035" type="#_x0000_t202" style="position:absolute;margin-left:273.75pt;margin-top:16.7pt;width:232.2pt;height:125.4pt;z-index:251684864;visibility:visible;mso-wrap-style:square;mso-width-percent:0;mso-height-percent:0;mso-wrap-distance-left:9pt;mso-wrap-distance-top:0;mso-wrap-distance-right:9pt;mso-wrap-distance-bottom:0;mso-position-horizontal:absolute;mso-position-horizontal-relative:text;mso-position-vertical:absolute;mso-position-vertical-relative:text;mso-width-percent:0;mso-height-percent:0;mso-width-relative:margin;mso-height-relative:margin;v-text-anchor:top" o:gfxdata="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" fillcolor="white [3201]" stroked="f" strokeweight=".5pt">
+              <v:shape w14:anchorId="05739663" id="_x0000_s1035" type="#_x0000_t202" style="position:absolute;margin-left:273.75pt;margin-top:16.7pt;width:232.2pt;height:125.4pt;z-index:251664896;visibility:visible;mso-wrap-style:square;mso-width-percent:0;mso-height-percent:0;mso-wrap-distance-left:9pt;mso-wrap-distance-top:0;mso-wrap-distance-right:9pt;mso-wrap-distance-bottom:0;mso-position-horizontal:absolute;mso-position-horizontal-relative:text;mso-position-vertical:absolute;mso-position-vertical-relative:text;mso-width-percent:0;mso-height-percent:0;mso-width-relative:margin;mso-height-relative:margin;v-text-anchor:top" o:gfxdata="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" fillcolor="white [3201]" stroked="f" strokeweight=".5pt">
                 <v:textbox>
                   <w:txbxContent>
                     <w:p>
@@ -5719,7 +5712,6 @@
           <w:b/>
           <w:bCs/>
         </w:rPr>
-        <w:lastRenderedPageBreak/>
         <w:t>M</w:t>
       </w:r>
       <w:r>
@@ -5749,7 +5741,7 @@
           <w:noProof/>
         </w:rPr>
         <w:drawing>
-          <wp:anchor distT="0" distB="0" distL="114300" distR="114300" simplePos="0" relativeHeight="251672576" behindDoc="0" locked="0" layoutInCell="1" allowOverlap="1" wp14:anchorId="5130CBDC" wp14:editId="144A9B6A">
+          <wp:anchor distT="0" distB="0" distL="114300" distR="114300" simplePos="0" relativeHeight="251657728" behindDoc="0" locked="0" layoutInCell="1" allowOverlap="1" wp14:anchorId="5130CBDC" wp14:editId="7395FAE5">
             <wp:simplePos x="0" y="0"/>
             <wp:positionH relativeFrom="column">
               <wp:posOffset>375285</wp:posOffset>
@@ -5842,7 +5834,7 @@
         <mc:AlternateContent>
           <mc:Choice Requires="wps">
             <w:drawing>
-              <wp:anchor distT="0" distB="0" distL="114300" distR="114300" simplePos="0" relativeHeight="251686912" behindDoc="0" locked="0" layoutInCell="1" allowOverlap="1" wp14:anchorId="6F676A7A" wp14:editId="2EC7068A">
+              <wp:anchor distT="0" distB="0" distL="114300" distR="114300" simplePos="0" relativeHeight="251665920" behindDoc="0" locked="0" layoutInCell="1" allowOverlap="1" wp14:anchorId="6F676A7A" wp14:editId="2EC7068A">
                 <wp:simplePos x="0" y="0"/>
                 <wp:positionH relativeFrom="column">
                   <wp:posOffset>3469005</wp:posOffset>
@@ -6090,7 +6082,7 @@
           </mc:Choice>
           <mc:Fallback>
             <w:pict>
-              <v:shape w14:anchorId="6F676A7A" id="_x0000_s1036" type="#_x0000_t202" style="position:absolute;margin-left:273.15pt;margin-top:.35pt;width:255.8pt;height:141.6pt;z-index:251686912;visibility:visible;mso-wrap-style:square;mso-width-percent:0;mso-height-percent:0;mso-wrap-distance-left:9pt;mso-wrap-distance-top:0;mso-wrap-distance-right:9pt;mso-wrap-distance-bottom:0;mso-position-horizontal:absolute;mso-position-horizontal-relative:text;mso-position-vertical:absolute;mso-position-vertical-relative:text;mso-width-percent:0;mso-height-percent:0;mso-width-relative:margin;mso-height-relative:margin;v-text-anchor:top" o:gfxdata="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" fillcolor="white [3201]" stroked="f" strokeweight=".5pt">
+              <v:shape w14:anchorId="6F676A7A" id="_x0000_s1036" type="#_x0000_t202" style="position:absolute;margin-left:273.15pt;margin-top:.35pt;width:255.8pt;height:141.6pt;z-index:251665920;visibility:visible;mso-wrap-style:square;mso-width-percent:0;mso-height-percent:0;mso-wrap-distance-left:9pt;mso-wrap-distance-top:0;mso-wrap-distance-right:9pt;mso-wrap-distance-bottom:0;mso-position-horizontal:absolute;mso-position-horizontal-relative:text;mso-position-vertical:absolute;mso-position-vertical-relative:text;mso-width-percent:0;mso-height-percent:0;mso-width-relative:margin;mso-height-relative:margin;v-text-anchor:top" o:gfxdata="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" fillcolor="white [3201]" stroked="f" strokeweight=".5pt">
                 <v:textbox>
                   <w:txbxContent>
                     <w:p>
@@ -6382,7 +6374,7 @@
           <w:noProof/>
         </w:rPr>
         <w:drawing>
-          <wp:anchor distT="0" distB="0" distL="114300" distR="114300" simplePos="0" relativeHeight="251673600" behindDoc="0" locked="0" layoutInCell="1" allowOverlap="1" wp14:anchorId="2B089E84" wp14:editId="7F58FF64">
+          <wp:anchor distT="0" distB="0" distL="114300" distR="114300" simplePos="0" relativeHeight="251658752" behindDoc="0" locked="0" layoutInCell="1" allowOverlap="1" wp14:anchorId="2B089E84" wp14:editId="6BD8B49E">
             <wp:simplePos x="0" y="0"/>
             <wp:positionH relativeFrom="margin">
               <wp:posOffset>391160</wp:posOffset>
@@ -6469,7 +6461,7 @@
         <mc:AlternateContent>
           <mc:Choice Requires="wps">
             <w:drawing>
-              <wp:anchor distT="0" distB="0" distL="114300" distR="114300" simplePos="0" relativeHeight="251688960" behindDoc="0" locked="0" layoutInCell="1" allowOverlap="1" wp14:anchorId="1CBCC245" wp14:editId="1D532E86">
+              <wp:anchor distT="0" distB="0" distL="114300" distR="114300" simplePos="0" relativeHeight="251666944" behindDoc="0" locked="0" layoutInCell="1" allowOverlap="1" wp14:anchorId="1CBCC245" wp14:editId="1D532E86">
                 <wp:simplePos x="0" y="0"/>
                 <wp:positionH relativeFrom="column">
                   <wp:posOffset>3522345</wp:posOffset>
@@ -6585,7 +6577,7 @@
           </mc:Choice>
           <mc:Fallback>
             <w:pict>
-              <v:shape w14:anchorId="1CBCC245" id="_x0000_s1037" type="#_x0000_t202" style="position:absolute;margin-left:277.35pt;margin-top:.75pt;width:251.6pt;height:127.8pt;z-index:251688960;visibility:visible;mso-wrap-style:square;mso-width-percent:0;mso-height-percent:0;mso-wrap-distance-left:9pt;mso-wrap-distance-top:0;mso-wrap-distance-right:9pt;mso-wrap-distance-bottom:0;mso-position-horizontal:absolute;mso-position-horizontal-relative:text;mso-position-vertical:absolute;mso-position-vertical-relative:text;mso-width-percent:0;mso-height-percent:0;mso-width-relative:margin;mso-height-relative:margin;v-text-anchor:top" o:gfxdata="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" fillcolor="white [3201]" stroked="f" strokeweight=".5pt">
+              <v:shape w14:anchorId="1CBCC245" id="_x0000_s1037" type="#_x0000_t202" style="position:absolute;margin-left:277.35pt;margin-top:.75pt;width:251.6pt;height:127.8pt;z-index:251666944;visibility:visible;mso-wrap-style:square;mso-width-percent:0;mso-height-percent:0;mso-wrap-distance-left:9pt;mso-wrap-distance-top:0;mso-wrap-distance-right:9pt;mso-wrap-distance-bottom:0;mso-position-horizontal:absolute;mso-position-horizontal-relative:text;mso-position-vertical:absolute;mso-position-vertical-relative:text;mso-width-percent:0;mso-height-percent:0;mso-width-relative:margin;mso-height-relative:margin;v-text-anchor:top" o:gfxdata="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" fillcolor="white [3201]" stroked="f" strokeweight=".5pt">
                 <v:textbox>
                   <w:txbxContent>
                     <w:p>
@@ -6816,6 +6808,7 @@
         </w:numPr>
       </w:pPr>
       <w:r>
+        <w:lastRenderedPageBreak/>
         <w:t>El sistema genera el comprobante.</w:t>
       </w:r>
     </w:p>
@@ -6836,7 +6829,6 @@
           <w:b/>
           <w:bCs/>
         </w:rPr>
-        <w:lastRenderedPageBreak/>
         <w:t>Flujos Alternativos:</w:t>
       </w:r>
     </w:p>
@@ -6994,8 +6986,11 @@
         <w:ind w:left="720"/>
       </w:pPr>
       <w:r>
+        <w:rPr>
+          <w:noProof/>
+        </w:rPr>
         <w:drawing>
-          <wp:anchor distT="0" distB="0" distL="114300" distR="114300" simplePos="0" relativeHeight="251691008" behindDoc="0" locked="0" layoutInCell="1" allowOverlap="1" wp14:anchorId="4BC8CF59" wp14:editId="1CCB832B">
+          <wp:anchor distT="0" distB="0" distL="114300" distR="114300" simplePos="0" relativeHeight="251668992" behindDoc="0" locked="0" layoutInCell="1" allowOverlap="1" wp14:anchorId="4BC8CF59" wp14:editId="1CCB832B">
             <wp:simplePos x="0" y="0"/>
             <wp:positionH relativeFrom="margin">
               <wp:align>center</wp:align>
@@ -7113,17 +7108,21 @@
     </w:p>
     <w:p>
       <w:r>
+        <w:rPr>
+          <w:noProof/>
+        </w:rPr>
+        <w:lastRenderedPageBreak/>
         <w:drawing>
-          <wp:anchor distT="0" distB="0" distL="114300" distR="114300" simplePos="0" relativeHeight="251689984" behindDoc="0" locked="0" layoutInCell="1" allowOverlap="1" wp14:anchorId="42D496BD" wp14:editId="6D3B7384">
+          <wp:anchor distT="0" distB="0" distL="114300" distR="114300" simplePos="0" relativeHeight="251667968" behindDoc="0" locked="0" layoutInCell="1" allowOverlap="1" wp14:anchorId="42D496BD" wp14:editId="5A77B0CC">
             <wp:simplePos x="0" y="0"/>
             <wp:positionH relativeFrom="margin">
-              <wp:align>center</wp:align>
+              <wp:posOffset>867593</wp:posOffset>
             </wp:positionH>
             <wp:positionV relativeFrom="paragraph">
-              <wp:posOffset>107515</wp:posOffset>
+              <wp:posOffset>102870</wp:posOffset>
             </wp:positionV>
-            <wp:extent cx="3667760" cy="1949450"/>
-            <wp:effectExtent l="76200" t="76200" r="142240" b="127000"/>
+            <wp:extent cx="4283710" cy="2276475"/>
+            <wp:effectExtent l="76200" t="76200" r="135890" b="142875"/>
             <wp:wrapSquare wrapText="bothSides"/>
             <wp:docPr id="1110918402" name="Imagen 1" descr="Interfaz de usuario gráfica, Aplicación, Word&#10;&#10;El contenido generado por IA puede ser incorrecto."/>
             <wp:cNvGraphicFramePr>
@@ -7151,7 +7150,7 @@
                   <pic:spPr>
                     <a:xfrm>
                       <a:off x="0" y="0"/>
-                      <a:ext cx="3667760" cy="1949450"/>
+                      <a:ext cx="4283710" cy="2276475"/>
                     </a:xfrm>
                     <a:prstGeom prst="rect">
                       <a:avLst/>
@@ -7461,6 +7460,7 @@
           <w:b/>
           <w:bCs/>
         </w:rPr>
+        <w:lastRenderedPageBreak/>
         <w:t>Prototipos:</w:t>
       </w:r>
     </w:p>
@@ -7476,27 +7476,21 @@
       </w:r>
     </w:p>
     <w:p/>
-    <w:p/>
-    <w:p/>
-    <w:p/>
-    <w:p/>
-    <w:p/>
-    <w:p/>
-    <w:p/>
-    <w:p>
-      <w:r>
-        <w:rPr>
-          <w:b/>
-          <w:bCs/>
+    <w:p>
+      <w:r>
+        <w:rPr>
+          <w:b/>
+          <w:bCs/>
+          <w:noProof/>
         </w:rPr>
         <w:drawing>
-          <wp:anchor distT="0" distB="0" distL="114300" distR="114300" simplePos="0" relativeHeight="251692032" behindDoc="0" locked="0" layoutInCell="1" allowOverlap="1" wp14:anchorId="33D92681" wp14:editId="7EE82757">
+          <wp:anchor distT="0" distB="0" distL="114300" distR="114300" simplePos="0" relativeHeight="251670016" behindDoc="0" locked="0" layoutInCell="1" allowOverlap="1" wp14:anchorId="33D92681" wp14:editId="134F888C">
             <wp:simplePos x="0" y="0"/>
             <wp:positionH relativeFrom="margin">
-              <wp:posOffset>1717508</wp:posOffset>
+              <wp:posOffset>1728057</wp:posOffset>
             </wp:positionH>
             <wp:positionV relativeFrom="paragraph">
-              <wp:posOffset>12633</wp:posOffset>
+              <wp:posOffset>149829</wp:posOffset>
             </wp:positionV>
             <wp:extent cx="2820035" cy="3414395"/>
             <wp:effectExtent l="76200" t="76200" r="132715" b="128905"/>
@@ -7572,6 +7566,7 @@
     <w:p/>
     <w:p/>
     <w:p/>
+    <w:p/>
     <w:p>
       <w:r>
         <w:pict w14:anchorId="16FB74C3">
@@ -7742,6 +7737,7 @@
           <w:b/>
           <w:bCs/>
         </w:rPr>
+        <w:lastRenderedPageBreak/>
         <w:t>Precondiciones</w:t>
       </w:r>
     </w:p>
@@ -7784,7 +7780,6 @@
         </w:numPr>
       </w:pPr>
       <w:r>
-        <w:lastRenderedPageBreak/>
         <w:t>Comprobante entregado.</w:t>
       </w:r>
     </w:p>
@@ -7830,8 +7825,11 @@
     </w:p>
     <w:p>
       <w:r>
+        <w:rPr>
+          <w:noProof/>
+        </w:rPr>
         <w:drawing>
-          <wp:anchor distT="0" distB="0" distL="114300" distR="114300" simplePos="0" relativeHeight="251693056" behindDoc="0" locked="0" layoutInCell="1" allowOverlap="1" wp14:anchorId="66A0D1BE" wp14:editId="37CF0081">
+          <wp:anchor distT="0" distB="0" distL="114300" distR="114300" simplePos="0" relativeHeight="251671040" behindDoc="0" locked="0" layoutInCell="1" allowOverlap="1" wp14:anchorId="66A0D1BE" wp14:editId="37CF0081">
             <wp:simplePos x="0" y="0"/>
             <wp:positionH relativeFrom="margin">
               <wp:align>center</wp:align>
@@ -8064,6 +8062,7 @@
           <w:b/>
           <w:bCs/>
         </w:rPr>
+        <w:lastRenderedPageBreak/>
         <w:t>Flujos Alternativos:</w:t>
       </w:r>
     </w:p>
@@ -8122,7 +8121,6 @@
         </w:numPr>
       </w:pPr>
       <w:r>
-        <w:lastRenderedPageBreak/>
         <w:t>Inventario actualizado.</w:t>
       </w:r>
     </w:p>
@@ -8163,8 +8161,11 @@
         </w:numPr>
       </w:pPr>
       <w:r>
+        <w:rPr>
+          <w:noProof/>
+        </w:rPr>
         <w:drawing>
-          <wp:anchor distT="0" distB="0" distL="114300" distR="114300" simplePos="0" relativeHeight="251694080" behindDoc="0" locked="0" layoutInCell="1" allowOverlap="1" wp14:anchorId="2553D692" wp14:editId="162C2D35">
+          <wp:anchor distT="0" distB="0" distL="114300" distR="114300" simplePos="0" relativeHeight="251672064" behindDoc="0" locked="0" layoutInCell="1" allowOverlap="1" wp14:anchorId="2553D692" wp14:editId="4AF6744E">
             <wp:simplePos x="0" y="0"/>
             <wp:positionH relativeFrom="margin">
               <wp:align>left</wp:align>
@@ -8354,6 +8355,7 @@
         </w:numPr>
       </w:pPr>
       <w:r>
+        <w:lastRenderedPageBreak/>
         <w:t>Administrador puede exportar.</w:t>
       </w:r>
     </w:p>
@@ -8421,7 +8423,6 @@
         </w:numPr>
       </w:pPr>
       <w:r>
-        <w:lastRenderedPageBreak/>
         <w:t>Reporte disponible.</w:t>
       </w:r>
     </w:p>
@@ -8467,6 +8468,9 @@
     </w:p>
     <w:p>
       <w:r>
+        <w:rPr>
+          <w:noProof/>
+        </w:rPr>
         <w:drawing>
           <wp:inline distT="0" distB="0" distL="0" distR="0" wp14:anchorId="3B044A87" wp14:editId="6CD7493B">
             <wp:extent cx="6300470" cy="2997200"/>
@@ -8630,6 +8634,7 @@
         </w:numPr>
       </w:pPr>
       <w:r>
+        <w:lastRenderedPageBreak/>
         <w:t>Verifica calidad y cantidad.</w:t>
       </w:r>
     </w:p>
@@ -8699,7 +8704,6 @@
         </w:numPr>
       </w:pPr>
       <w:r>
-        <w:lastRenderedPageBreak/>
         <w:t>Almacenero logueado.</w:t>
       </w:r>
     </w:p>
@@ -8765,6 +8769,9 @@
     </w:p>
     <w:p>
       <w:r>
+        <w:rPr>
+          <w:noProof/>
+        </w:rPr>
         <w:drawing>
           <wp:inline distT="0" distB="0" distL="0" distR="0" wp14:anchorId="049FEC5E" wp14:editId="55D86BAC">
             <wp:extent cx="6300470" cy="3011805"/>
@@ -8906,6 +8913,7 @@
           <w:b/>
           <w:bCs/>
         </w:rPr>
+        <w:lastRenderedPageBreak/>
         <w:t>Flujo Básico:</w:t>
       </w:r>
     </w:p>
@@ -8968,7 +8976,6 @@
           <w:b/>
           <w:bCs/>
         </w:rPr>
-        <w:lastRenderedPageBreak/>
         <w:t>Poscondiciones</w:t>
       </w:r>
     </w:p>
@@ -9026,8 +9033,11 @@
         </w:numPr>
       </w:pPr>
       <w:r>
+        <w:rPr>
+          <w:noProof/>
+        </w:rPr>
         <w:drawing>
-          <wp:anchor distT="0" distB="0" distL="114300" distR="114300" simplePos="0" relativeHeight="251695104" behindDoc="0" locked="0" layoutInCell="1" allowOverlap="1" wp14:anchorId="67CF9BF5" wp14:editId="143A9502">
+          <wp:anchor distT="0" distB="0" distL="114300" distR="114300" simplePos="0" relativeHeight="251673088" behindDoc="0" locked="0" layoutInCell="1" allowOverlap="1" wp14:anchorId="67CF9BF5" wp14:editId="257314EC">
             <wp:simplePos x="0" y="0"/>
             <wp:positionH relativeFrom="margin">
               <wp:align>left</wp:align>
@@ -9195,6 +9205,7 @@
         </w:numPr>
       </w:pPr>
       <w:r>
+        <w:lastRenderedPageBreak/>
         <w:t>Administrador visualiza lista de usuarios.</w:t>
       </w:r>
     </w:p>
@@ -9270,7 +9281,6 @@
         </w:numPr>
       </w:pPr>
       <w:r>
-        <w:lastRenderedPageBreak/>
         <w:t>Usuarios actualizados.</w:t>
       </w:r>
     </w:p>
@@ -9316,6 +9326,9 @@
     </w:p>
     <w:p>
       <w:r>
+        <w:rPr>
+          <w:noProof/>
+        </w:rPr>
         <w:drawing>
           <wp:inline distT="0" distB="0" distL="0" distR="0" wp14:anchorId="6A1028DE" wp14:editId="0E660F83">
             <wp:extent cx="6300470" cy="2998470"/>
@@ -9375,14 +9388,6 @@
     <w:p/>
     <w:p/>
     <w:p/>
-    <w:p/>
-    <w:p/>
-    <w:p/>
-    <w:p/>
-    <w:p/>
-    <w:p/>
-    <w:p/>
-    <w:p/>
     <w:p>
       <w:pPr>
         <w:pStyle w:val="Citadestacada"/>
@@ -9395,37 +9400,19 @@
         <w:ind w:left="0" w:right="-1"/>
         <w:jc w:val="left"/>
         <w:rPr>
+          <w:b/>
+          <w:bCs/>
+          <w:color w:val="000000" w:themeColor="text1"/>
+        </w:rPr>
+      </w:pPr>
+      <w:r>
+        <w:rPr>
           <w:rStyle w:val="CitadestacadaCar"/>
           <w:b/>
           <w:bCs/>
           <w:color w:val="auto"/>
         </w:rPr>
-      </w:pPr>
-    </w:p>
-    <w:p>
-      <w:pPr>
-        <w:pStyle w:val="Citadestacada"/>
-        <w:pBdr>
-          <w:bottom w:val="single" w:sz="4" w:space="0" w:color="0F4761" w:themeColor="accent1" w:themeShade="BF"/>
-        </w:pBdr>
-        <w:tabs>
-          <w:tab w:val="left" w:pos="2168"/>
-        </w:tabs>
-        <w:ind w:left="0" w:right="-1"/>
-        <w:jc w:val="left"/>
-        <w:rPr>
-          <w:b/>
-          <w:bCs/>
-          <w:color w:val="000000" w:themeColor="text1"/>
-        </w:rPr>
-      </w:pPr>
-      <w:r>
-        <w:rPr>
-          <w:rStyle w:val="CitadestacadaCar"/>
-          <w:b/>
-          <w:bCs/>
-          <w:color w:val="auto"/>
-        </w:rPr>
+        <w:lastRenderedPageBreak/>
         <w:t>CAPITULO V</w:t>
       </w:r>
     </w:p>
@@ -9455,9 +9442,10 @@
         <w:rPr>
           <w:b/>
           <w:bCs/>
+          <w:noProof/>
         </w:rPr>
         <w:drawing>
-          <wp:anchor distT="0" distB="0" distL="114300" distR="114300" simplePos="0" relativeHeight="251648000" behindDoc="0" locked="0" layoutInCell="1" allowOverlap="1" wp14:anchorId="7B32B74A" wp14:editId="6E2C4861">
+          <wp:anchor distT="0" distB="0" distL="114300" distR="114300" simplePos="0" relativeHeight="251642368" behindDoc="0" locked="0" layoutInCell="1" allowOverlap="1" wp14:anchorId="7B32B74A" wp14:editId="6E2C4861">
             <wp:simplePos x="0" y="0"/>
             <wp:positionH relativeFrom="margin">
               <wp:align>left</wp:align>
@@ -9540,10 +9528,11 @@
         <w:rPr>
           <w:b/>
           <w:bCs/>
+          <w:noProof/>
         </w:rPr>
         <w:lastRenderedPageBreak/>
         <w:drawing>
-          <wp:anchor distT="0" distB="0" distL="114300" distR="114300" simplePos="0" relativeHeight="251654144" behindDoc="0" locked="0" layoutInCell="1" allowOverlap="1" wp14:anchorId="33D33EF6" wp14:editId="76D1E633">
+          <wp:anchor distT="0" distB="0" distL="114300" distR="114300" simplePos="0" relativeHeight="251643392" behindDoc="0" locked="0" layoutInCell="1" allowOverlap="1" wp14:anchorId="33D33EF6" wp14:editId="76D1E633">
             <wp:simplePos x="0" y="0"/>
             <wp:positionH relativeFrom="margin">
               <wp:align>center</wp:align>
@@ -9639,9 +9628,10 @@
         <w:rPr>
           <w:b/>
           <w:bCs/>
+          <w:noProof/>
         </w:rPr>
         <w:drawing>
-          <wp:anchor distT="0" distB="0" distL="114300" distR="114300" simplePos="0" relativeHeight="251669504" behindDoc="0" locked="0" layoutInCell="1" allowOverlap="1" wp14:anchorId="12EB4295" wp14:editId="7625E12F">
+          <wp:anchor distT="0" distB="0" distL="114300" distR="114300" simplePos="0" relativeHeight="251653632" behindDoc="0" locked="0" layoutInCell="1" allowOverlap="1" wp14:anchorId="12EB4295" wp14:editId="7625E12F">
             <wp:simplePos x="0" y="0"/>
             <wp:positionH relativeFrom="margin">
               <wp:align>center</wp:align>
@@ -9732,6 +9722,30 @@
         <w:rPr>
           <w:b/>
           <w:bCs/>
+        </w:rPr>
+      </w:pPr>
+      <w:r>
+        <w:rPr>
+          <w:b/>
+          <w:bCs/>
+        </w:rPr>
+        <w:t xml:space="preserve"> </w:t>
+      </w:r>
+    </w:p>
+    <w:p>
+      <w:pPr>
+        <w:pStyle w:val="Citadestacada"/>
+        <w:pBdr>
+          <w:bottom w:val="single" w:sz="4" w:space="0" w:color="0F4761" w:themeColor="accent1" w:themeShade="BF"/>
+        </w:pBdr>
+        <w:tabs>
+          <w:tab w:val="left" w:pos="2168"/>
+        </w:tabs>
+        <w:ind w:left="0" w:right="-1"/>
+        <w:jc w:val="left"/>
+        <w:rPr>
+          <w:b/>
+          <w:bCs/>
           <w:color w:val="000000" w:themeColor="text1"/>
         </w:rPr>
       </w:pPr>
@@ -9740,13 +9754,7 @@
           <w:b/>
           <w:bCs/>
         </w:rPr>
-        <w:t xml:space="preserve"> </w:t>
-      </w:r>
-      <w:r>
-        <w:rPr>
-          <w:b/>
-          <w:bCs/>
-        </w:rPr>
+        <w:lastRenderedPageBreak/>
         <w:br/>
       </w:r>
       <w:r>
@@ -9780,7 +9788,6 @@
           <w:b/>
           <w:bCs/>
         </w:rPr>
-        <w:lastRenderedPageBreak/>
         <w:t>Base de datos en phpMyAdmin</w:t>
       </w:r>
     </w:p>
@@ -9795,6 +9802,7 @@
         <w:rPr>
           <w:b/>
           <w:bCs/>
+          <w:noProof/>
         </w:rPr>
         <w:drawing>
           <wp:inline distT="0" distB="0" distL="0" distR="0" wp14:anchorId="060B1049" wp14:editId="2E36ED7A">
@@ -9854,14 +9862,6 @@
           <w:bCs/>
         </w:rPr>
       </w:pPr>
-    </w:p>
-    <w:p>
-      <w:pPr>
-        <w:rPr>
-          <w:b/>
-          <w:bCs/>
-        </w:rPr>
-      </w:pPr>
       <w:r>
         <w:rPr>
           <w:b/>
@@ -9881,11 +9881,20 @@
         <w:rPr>
           <w:b/>
           <w:bCs/>
+          <w:noProof/>
         </w:rPr>
         <w:drawing>
-          <wp:inline distT="0" distB="0" distL="0" distR="0" wp14:anchorId="4FBBB44A" wp14:editId="3ACFD05E">
-            <wp:extent cx="6300470" cy="4577080"/>
-            <wp:effectExtent l="76200" t="76200" r="138430" b="128270"/>
+          <wp:anchor distT="0" distB="0" distL="114300" distR="114300" simplePos="0" relativeHeight="251674112" behindDoc="0" locked="0" layoutInCell="1" allowOverlap="1" wp14:anchorId="4FBBB44A" wp14:editId="201E01FC">
+            <wp:simplePos x="0" y="0"/>
+            <wp:positionH relativeFrom="column">
+              <wp:posOffset>612851</wp:posOffset>
+            </wp:positionH>
+            <wp:positionV relativeFrom="paragraph">
+              <wp:posOffset>64548</wp:posOffset>
+            </wp:positionV>
+            <wp:extent cx="5487319" cy="3986353"/>
+            <wp:effectExtent l="76200" t="76200" r="132715" b="128905"/>
+            <wp:wrapSquare wrapText="bothSides"/>
             <wp:docPr id="1434761289" name="Imagen 1"/>
             <wp:cNvGraphicFramePr>
               <a:graphicFrameLocks xmlns:a="http://schemas.openxmlformats.org/drawingml/2006/main" noChangeAspect="1"/>
@@ -9898,7 +9907,13 @@
                     <pic:cNvPicPr/>
                   </pic:nvPicPr>
                   <pic:blipFill>
-                    <a:blip r:embed="rId32"/>
+                    <a:blip r:embed="rId32">
+                      <a:extLst>
+                        <a:ext uri="{28A0092B-C50C-407E-A947-70E740481C1C}">
+                          <a14:useLocalDpi xmlns:a14="http://schemas.microsoft.com/office/drawing/2010/main" val="0"/>
+                        </a:ext>
+                      </a:extLst>
+                    </a:blip>
                     <a:stretch>
                       <a:fillRect/>
                     </a:stretch>
@@ -9906,7 +9921,7 @@
                   <pic:spPr>
                     <a:xfrm>
                       <a:off x="0" y="0"/>
-                      <a:ext cx="6300470" cy="4577080"/>
+                      <a:ext cx="5487319" cy="3986353"/>
                     </a:xfrm>
                     <a:prstGeom prst="rect">
                       <a:avLst/>
@@ -9929,7 +9944,7 @@
                 </pic:pic>
               </a:graphicData>
             </a:graphic>
-          </wp:inline>
+          </wp:anchor>
         </w:drawing>
       </w:r>
     </w:p>
@@ -9959,83 +9974,488 @@
     </w:p>
     <w:p>
       <w:pPr>
-        <w:rPr>
-          <w:b/>
-          <w:bCs/>
-        </w:rPr>
-      </w:pPr>
-    </w:p>
-    <w:p/>
-    <w:p>
-      <w:r>
-        <w:t>10. CONCLUSIONES</w:t>
-      </w:r>
-    </w:p>
-    <w:p>
-      <w:r>
-        <w:t xml:space="preserve">    - Logros alcanzados</w:t>
-      </w:r>
-    </w:p>
-    <w:p>
-      <w:r>
-        <w:t xml:space="preserve">    - Dificultades superadas</w:t>
-      </w:r>
-    </w:p>
-    <w:p>
-      <w:r>
-        <w:t xml:space="preserve">    - Aprendizajes</w:t>
-      </w:r>
-    </w:p>
-    <w:p/>
-    <w:p>
-      <w:r>
-        <w:t>11. RECOMENDACIONES</w:t>
-      </w:r>
-    </w:p>
-    <w:p>
-      <w:r>
-        <w:t xml:space="preserve">    - Para el negocio</w:t>
-      </w:r>
-    </w:p>
-    <w:p>
-      <w:r>
-        <w:t xml:space="preserve">    - Para futuras mejoras</w:t>
-      </w:r>
-    </w:p>
-    <w:p>
-      <w:r>
-        <w:t xml:space="preserve">    - Para mantenimiento</w:t>
-      </w:r>
-    </w:p>
-    <w:p/>
-    <w:p>
-      <w:r>
-        <w:t>12. ANEXOS</w:t>
-      </w:r>
-    </w:p>
-    <w:p>
-      <w:r>
-        <w:t xml:space="preserve">    - Códigos SQL</w:t>
-      </w:r>
-    </w:p>
-    <w:p>
-      <w:r>
-        <w:t xml:space="preserve">    - Manual de usuario</w:t>
-      </w:r>
-    </w:p>
-    <w:p>
-      <w:pPr>
-        <w:rPr>
-          <w:b/>
-          <w:bCs/>
-        </w:rPr>
-      </w:pPr>
-      <w:r>
-        <w:rPr>
-          <w:b/>
-          <w:bCs/>
-        </w:rPr>
-        <w:t xml:space="preserve">    - Enlace GitHub</w:t>
+        <w:pStyle w:val="Citadestacada"/>
+        <w:pBdr>
+          <w:bottom w:val="single" w:sz="4" w:space="0" w:color="0F4761" w:themeColor="accent1" w:themeShade="BF"/>
+        </w:pBdr>
+        <w:tabs>
+          <w:tab w:val="left" w:pos="2168"/>
+        </w:tabs>
+        <w:ind w:left="0" w:right="-1"/>
+        <w:jc w:val="left"/>
+        <w:rPr>
+          <w:b/>
+          <w:bCs/>
+          <w:color w:val="000000" w:themeColor="text1"/>
+        </w:rPr>
+      </w:pPr>
+      <w:r>
+        <w:rPr>
+          <w:rStyle w:val="CitadestacadaCar"/>
+          <w:b/>
+          <w:bCs/>
+          <w:color w:val="auto"/>
+        </w:rPr>
+        <w:t>CAPITULO V</w:t>
+      </w:r>
+      <w:r>
+        <w:rPr>
+          <w:rStyle w:val="CitadestacadaCar"/>
+          <w:b/>
+          <w:bCs/>
+          <w:color w:val="auto"/>
+        </w:rPr>
+        <w:t>II</w:t>
+      </w:r>
+    </w:p>
+    <w:p>
+      <w:pPr>
+        <w:jc w:val="both"/>
+        <w:rPr>
+          <w:b/>
+          <w:bCs/>
+        </w:rPr>
+      </w:pPr>
+      <w:r>
+        <w:rPr>
+          <w:b/>
+          <w:bCs/>
+        </w:rPr>
+        <w:t>CONCLUSIONES</w:t>
+      </w:r>
+    </w:p>
+    <w:p>
+      <w:pPr>
+        <w:numPr>
+          <w:ilvl w:val="0"/>
+          <w:numId w:val="60"/>
+        </w:numPr>
+        <w:jc w:val="both"/>
+        <w:rPr>
+          <w:b/>
+          <w:bCs/>
+        </w:rPr>
+      </w:pPr>
+      <w:r>
+        <w:rPr>
+          <w:b/>
+          <w:bCs/>
+        </w:rPr>
+        <w:t>Logros alcanzados</w:t>
+      </w:r>
+    </w:p>
+    <w:p>
+      <w:pPr>
+        <w:numPr>
+          <w:ilvl w:val="1"/>
+          <w:numId w:val="60"/>
+        </w:numPr>
+        <w:jc w:val="both"/>
+      </w:pPr>
+      <w:r>
+        <w:lastRenderedPageBreak/>
+        <w:t>Se logró diseñar y modelar una solución de software que automatiza los procesos críticos de la cebichería, específicamente la gestión de ventas, el control de inventarios y la emisión de comprobantes, cumpliendo con el objetivo de reducir la operatividad manual.</w:t>
+      </w:r>
+    </w:p>
+    <w:p>
+      <w:pPr>
+        <w:numPr>
+          <w:ilvl w:val="1"/>
+          <w:numId w:val="60"/>
+        </w:numPr>
+        <w:jc w:val="both"/>
+      </w:pPr>
+      <w:r>
+        <w:t>Se establecieron correctamente los roles y permisos de usuario (Administrador, Cajero, Almacenero), garantizando que la información sensible, como los reportes de ganancias, esté restringida únicamente al personal autorizado.</w:t>
+      </w:r>
+    </w:p>
+    <w:p>
+      <w:pPr>
+        <w:numPr>
+          <w:ilvl w:val="1"/>
+          <w:numId w:val="60"/>
+        </w:numPr>
+        <w:jc w:val="both"/>
+      </w:pPr>
+      <w:r>
+        <w:t xml:space="preserve">La integración de una base de datos centralizada (gestionada en </w:t>
+      </w:r>
+      <w:proofErr w:type="spellStart"/>
+      <w:r>
+        <w:t>phpMyAdmin</w:t>
+      </w:r>
+      <w:proofErr w:type="spellEnd"/>
+      <w:r>
+        <w:t>) permite ahora la actualización en tiempo real del stock de productos cada vez que se realiza una venta o ingresan insumos, eliminando la inconsistencia de datos que generaban las libretas manuales.</w:t>
+      </w:r>
+    </w:p>
+    <w:p>
+      <w:pPr>
+        <w:numPr>
+          <w:ilvl w:val="0"/>
+          <w:numId w:val="60"/>
+        </w:numPr>
+        <w:jc w:val="both"/>
+        <w:rPr>
+          <w:b/>
+          <w:bCs/>
+        </w:rPr>
+      </w:pPr>
+      <w:r>
+        <w:rPr>
+          <w:b/>
+          <w:bCs/>
+        </w:rPr>
+        <w:t>Dificultades superadas</w:t>
+      </w:r>
+    </w:p>
+    <w:p>
+      <w:pPr>
+        <w:numPr>
+          <w:ilvl w:val="1"/>
+          <w:numId w:val="60"/>
+        </w:numPr>
+        <w:jc w:val="both"/>
+      </w:pPr>
+      <w:r>
+        <w:t xml:space="preserve">La transición de los requerimientos de negocio a un modelado técnico preciso utilizando herramientas como </w:t>
+      </w:r>
+      <w:proofErr w:type="spellStart"/>
+      <w:r>
+        <w:t>Rhapsody</w:t>
+      </w:r>
+      <w:proofErr w:type="spellEnd"/>
+      <w:r>
+        <w:t xml:space="preserve"> y </w:t>
+      </w:r>
+      <w:proofErr w:type="spellStart"/>
+      <w:r>
+        <w:t>Power</w:t>
+      </w:r>
+      <w:proofErr w:type="spellEnd"/>
+      <w:r>
+        <w:t xml:space="preserve"> </w:t>
+      </w:r>
+      <w:proofErr w:type="spellStart"/>
+      <w:r>
+        <w:t>Designer</w:t>
+      </w:r>
+      <w:proofErr w:type="spellEnd"/>
+      <w:r>
+        <w:t xml:space="preserve"> presentó desafíos iniciales para definir correctamente las relaciones entre entidades (como Venta y Detalle de Venta).</w:t>
+      </w:r>
+    </w:p>
+    <w:p>
+      <w:pPr>
+        <w:numPr>
+          <w:ilvl w:val="1"/>
+          <w:numId w:val="60"/>
+        </w:numPr>
+        <w:jc w:val="both"/>
+      </w:pPr>
+      <w:r>
+        <w:t>La definición de la arquitectura del sistema para separar la lógica de negocio de la interfaz de usuario (Controladores vs. Vistas) requirió varias iteraciones para asegurar que el código fuera modular y mantenible.</w:t>
+      </w:r>
+    </w:p>
+    <w:p>
+      <w:pPr>
+        <w:numPr>
+          <w:ilvl w:val="0"/>
+          <w:numId w:val="60"/>
+        </w:numPr>
+        <w:jc w:val="both"/>
+        <w:rPr>
+          <w:b/>
+          <w:bCs/>
+        </w:rPr>
+      </w:pPr>
+      <w:r>
+        <w:rPr>
+          <w:b/>
+          <w:bCs/>
+        </w:rPr>
+        <w:t>Aprendizajes</w:t>
+      </w:r>
+    </w:p>
+    <w:p>
+      <w:pPr>
+        <w:numPr>
+          <w:ilvl w:val="1"/>
+          <w:numId w:val="60"/>
+        </w:numPr>
+        <w:jc w:val="both"/>
+      </w:pPr>
+      <w:r>
+        <w:t>Se comprendió la importancia de la metodología de análisis de negocio (MCUN, MCUS, MAN) para traducir necesidades reales de una empresa (como la cebichería) en especificaciones técnicas funcionales.</w:t>
+      </w:r>
+    </w:p>
+    <w:p>
+      <w:pPr>
+        <w:numPr>
+          <w:ilvl w:val="1"/>
+          <w:numId w:val="60"/>
+        </w:numPr>
+        <w:jc w:val="both"/>
+      </w:pPr>
+      <w:r>
+        <w:t>Se reforzó el conocimiento sobre el diseño de bases de datos relacionales y su conexión con aplicaciones de software, asegurando la integridad de la información en transacciones comerciales.</w:t>
+      </w:r>
+    </w:p>
+    <w:p>
+      <w:pPr>
+        <w:jc w:val="both"/>
+        <w:rPr>
+          <w:b/>
+          <w:bCs/>
+        </w:rPr>
+      </w:pPr>
+      <w:r>
+        <w:rPr>
+          <w:b/>
+          <w:bCs/>
+        </w:rPr>
+        <w:pict w14:anchorId="06DC4CA4">
+          <v:rect id="_x0000_i1044" style="width:0;height:1.5pt" o:hralign="center" o:hrstd="t" o:hr="t" fillcolor="#a0a0a0" stroked="f"/>
+        </w:pict>
+      </w:r>
+    </w:p>
+    <w:p>
+      <w:pPr>
+        <w:jc w:val="both"/>
+        <w:rPr>
+          <w:b/>
+          <w:bCs/>
+        </w:rPr>
+      </w:pPr>
+      <w:r>
+        <w:rPr>
+          <w:b/>
+          <w:bCs/>
+        </w:rPr>
+        <w:t xml:space="preserve"> RECOMENDACIONES</w:t>
+      </w:r>
+    </w:p>
+    <w:p>
+      <w:pPr>
+        <w:numPr>
+          <w:ilvl w:val="0"/>
+          <w:numId w:val="61"/>
+        </w:numPr>
+        <w:jc w:val="both"/>
+        <w:rPr>
+          <w:b/>
+          <w:bCs/>
+        </w:rPr>
+      </w:pPr>
+      <w:r>
+        <w:rPr>
+          <w:b/>
+          <w:bCs/>
+        </w:rPr>
+        <w:t>Para el negocio</w:t>
+      </w:r>
+    </w:p>
+    <w:p>
+      <w:pPr>
+        <w:numPr>
+          <w:ilvl w:val="1"/>
+          <w:numId w:val="61"/>
+        </w:numPr>
+        <w:jc w:val="both"/>
+      </w:pPr>
+      <w:r>
+        <w:t>Se recomienda adquirir el hardware necesario, como lectores de códigos de barras e impresoras térmicas, para agilizar aún más el proceso de venta y aprovechar al máximo la funcionalidad de "Emisión de Comprobante" del sistema.</w:t>
+      </w:r>
+    </w:p>
+    <w:p>
+      <w:pPr>
+        <w:numPr>
+          <w:ilvl w:val="1"/>
+          <w:numId w:val="61"/>
+        </w:numPr>
+        <w:jc w:val="both"/>
+      </w:pPr>
+      <w:r>
+        <w:t>Capacitar al personal (especialmente a los cajeros y almaceneros) en el uso del nuevo sistema durante un periodo de marcha blanca, manteniendo el registro manual en paralelo durante las primeras semanas para validar la adaptación.</w:t>
+      </w:r>
+    </w:p>
+    <w:p>
+      <w:pPr>
+        <w:numPr>
+          <w:ilvl w:val="0"/>
+          <w:numId w:val="61"/>
+        </w:numPr>
+        <w:jc w:val="both"/>
+        <w:rPr>
+          <w:b/>
+          <w:bCs/>
+        </w:rPr>
+      </w:pPr>
+      <w:r>
+        <w:rPr>
+          <w:b/>
+          <w:bCs/>
+        </w:rPr>
+        <w:t>Para futuras mejoras</w:t>
+      </w:r>
+    </w:p>
+    <w:p>
+      <w:pPr>
+        <w:numPr>
+          <w:ilvl w:val="1"/>
+          <w:numId w:val="61"/>
+        </w:numPr>
+        <w:jc w:val="both"/>
+      </w:pPr>
+      <w:r>
+        <w:t xml:space="preserve">Implementar un módulo de "Pedidos en Mesa" mediante </w:t>
+      </w:r>
+      <w:proofErr w:type="spellStart"/>
+      <w:r>
+        <w:t>tablets</w:t>
+      </w:r>
+      <w:proofErr w:type="spellEnd"/>
+      <w:r>
+        <w:t xml:space="preserve"> o códigos QR para que los mozos o los propios clientes envíen la comanda directamente a cocina, reduciendo tiempos de espera.</w:t>
+      </w:r>
+    </w:p>
+    <w:p>
+      <w:pPr>
+        <w:numPr>
+          <w:ilvl w:val="1"/>
+          <w:numId w:val="61"/>
+        </w:numPr>
+        <w:jc w:val="both"/>
+      </w:pPr>
+      <w:r>
+        <w:t xml:space="preserve">Desarrollar un </w:t>
+      </w:r>
+      <w:proofErr w:type="spellStart"/>
+      <w:r>
+        <w:t>dashboard</w:t>
+      </w:r>
+      <w:proofErr w:type="spellEnd"/>
+      <w:r>
+        <w:t xml:space="preserve"> o tablero de control visual para el Administrador que muestre gráficos estadísticos de los platos más vendidos y los días de mayor afluencia, facilitando la toma de decisiones estratégicas.</w:t>
+      </w:r>
+    </w:p>
+    <w:p>
+      <w:pPr>
+        <w:numPr>
+          <w:ilvl w:val="1"/>
+          <w:numId w:val="61"/>
+        </w:numPr>
+        <w:jc w:val="both"/>
+      </w:pPr>
+      <w:r>
+        <w:lastRenderedPageBreak/>
+        <w:t>Integrar el sistema con facturación electrónica oficial (SUNAT) para automatizar el cumplimiento tributario directamente desde el software.</w:t>
+      </w:r>
+    </w:p>
+    <w:p>
+      <w:pPr>
+        <w:numPr>
+          <w:ilvl w:val="0"/>
+          <w:numId w:val="61"/>
+        </w:numPr>
+        <w:jc w:val="both"/>
+        <w:rPr>
+          <w:b/>
+          <w:bCs/>
+        </w:rPr>
+      </w:pPr>
+      <w:r>
+        <w:rPr>
+          <w:b/>
+          <w:bCs/>
+        </w:rPr>
+        <w:t>Para mantenimiento</w:t>
+      </w:r>
+    </w:p>
+    <w:p>
+      <w:pPr>
+        <w:numPr>
+          <w:ilvl w:val="1"/>
+          <w:numId w:val="61"/>
+        </w:numPr>
+        <w:jc w:val="both"/>
+      </w:pPr>
+      <w:r>
+        <w:t>Realizar copias de seguridad (</w:t>
+      </w:r>
+      <w:proofErr w:type="spellStart"/>
+      <w:r>
+        <w:t>backups</w:t>
+      </w:r>
+      <w:proofErr w:type="spellEnd"/>
+      <w:r>
+        <w:t>) de la base de datos semanalmente para prevenir la pérdida de información histórica de ventas e inventarios ante fallos técnicos.</w:t>
+      </w:r>
+    </w:p>
+    <w:p>
+      <w:pPr>
+        <w:numPr>
+          <w:ilvl w:val="1"/>
+          <w:numId w:val="61"/>
+        </w:numPr>
+        <w:jc w:val="both"/>
+      </w:pPr>
+      <w:r>
+        <w:t>Establecer una política de actualización de credenciales cada cierto tiempo para los usuarios con roles de Administrador y Cajero, manteniendo la seguridad del acceso al sistema.</w:t>
+      </w:r>
+    </w:p>
+    <w:p>
+      <w:pPr>
+        <w:jc w:val="both"/>
+        <w:rPr>
+          <w:b/>
+          <w:bCs/>
+        </w:rPr>
+      </w:pPr>
+      <w:r>
+        <w:rPr>
+          <w:b/>
+          <w:bCs/>
+        </w:rPr>
+        <w:pict w14:anchorId="4C74DCD6">
+          <v:rect id="_x0000_i1045" style="width:0;height:1.5pt" o:hralign="center" o:hrstd="t" o:hr="t" fillcolor="#a0a0a0" stroked="f"/>
+        </w:pict>
+      </w:r>
+    </w:p>
+    <w:p>
+      <w:pPr>
+        <w:jc w:val="both"/>
+        <w:rPr>
+          <w:b/>
+          <w:bCs/>
+        </w:rPr>
+      </w:pPr>
+      <w:r>
+        <w:rPr>
+          <w:b/>
+          <w:bCs/>
+        </w:rPr>
+        <w:t xml:space="preserve">ANEXOS </w:t>
+      </w:r>
+    </w:p>
+    <w:p>
+      <w:pPr>
+        <w:numPr>
+          <w:ilvl w:val="0"/>
+          <w:numId w:val="62"/>
+        </w:numPr>
+        <w:jc w:val="both"/>
+        <w:rPr>
+          <w:b/>
+          <w:bCs/>
+        </w:rPr>
+      </w:pPr>
+      <w:r>
+        <w:rPr>
+          <w:b/>
+          <w:bCs/>
+        </w:rPr>
+        <w:t>Enlace GitHub</w:t>
       </w:r>
       <w:r>
         <w:rPr>
@@ -10197,7 +10617,7 @@
       <w:headerReference w:type="first" r:id="rId36"/>
       <w:footerReference w:type="first" r:id="rId37"/>
       <w:pgSz w:w="11906" w:h="16838"/>
-      <w:pgMar w:top="977" w:right="991" w:bottom="568" w:left="993" w:header="708" w:footer="708" w:gutter="0"/>
+      <w:pgMar w:top="1276" w:right="991" w:bottom="426" w:left="993" w:header="708" w:footer="708" w:gutter="0"/>
       <w:pgNumType w:start="0"/>
       <w:cols w:space="708"/>
       <w:titlePg/>
@@ -10411,7 +10831,7 @@
           <wp:extent cx="1366158" cy="391886"/>
           <wp:effectExtent l="0" t="0" r="5715" b="8255"/>
           <wp:wrapNone/>
-          <wp:docPr id="2047551536" name="Imagen 1" descr="Forma&#10;&#10;El contenido generado por IA puede ser incorrecto."/>
+          <wp:docPr id="1476340040" name="Imagen 1" descr="Forma&#10;&#10;El contenido generado por IA puede ser incorrecto."/>
           <wp:cNvGraphicFramePr>
             <a:graphicFrameLocks xmlns:a="http://schemas.openxmlformats.org/drawingml/2006/main" noChangeAspect="1"/>
           </wp:cNvGraphicFramePr>
@@ -10482,7 +10902,7 @@
           <wp:extent cx="1365885" cy="391795"/>
           <wp:effectExtent l="0" t="0" r="5715" b="8255"/>
           <wp:wrapNone/>
-          <wp:docPr id="1853773608" name="Imagen 1" descr="Forma&#10;&#10;El contenido generado por IA puede ser incorrecto."/>
+          <wp:docPr id="2012609159" name="Imagen 1" descr="Forma&#10;&#10;El contenido generado por IA puede ser incorrecto."/>
           <wp:cNvGraphicFramePr>
             <a:graphicFrameLocks xmlns:a="http://schemas.openxmlformats.org/drawingml/2006/main" noChangeAspect="1"/>
           </wp:cNvGraphicFramePr>
@@ -12546,6 +12966,155 @@
     </w:lvl>
   </w:abstractNum>
   <w:abstractNum w:abstractNumId="14" w15:restartNumberingAfterBreak="0">
+    <w:nsid w:val="1CF810C2"/>
+    <w:multiLevelType w:val="multilevel"/>
+    <w:tmpl w:val="1CB2186E"/>
+    <w:lvl w:ilvl="0">
+      <w:start w:val="1"/>
+      <w:numFmt w:val="bullet"/>
+      <w:lvlText w:val=""/>
+      <w:lvlJc w:val="left"/>
+      <w:pPr>
+        <w:tabs>
+          <w:tab w:val="num" w:pos="720"/>
+        </w:tabs>
+        <w:ind w:left="720" w:hanging="360"/>
+      </w:pPr>
+      <w:rPr>
+        <w:rFonts w:ascii="Symbol" w:hAnsi="Symbol" w:hint="default"/>
+        <w:sz w:val="20"/>
+      </w:rPr>
+    </w:lvl>
+    <w:lvl w:ilvl="1">
+      <w:start w:val="1"/>
+      <w:numFmt w:val="bullet"/>
+      <w:lvlText w:val="o"/>
+      <w:lvlJc w:val="left"/>
+      <w:pPr>
+        <w:tabs>
+          <w:tab w:val="num" w:pos="1440"/>
+        </w:tabs>
+        <w:ind w:left="1440" w:hanging="360"/>
+      </w:pPr>
+      <w:rPr>
+        <w:rFonts w:ascii="Courier New" w:hAnsi="Courier New" w:hint="default"/>
+        <w:sz w:val="20"/>
+      </w:rPr>
+    </w:lvl>
+    <w:lvl w:ilvl="2" w:tentative="1">
+      <w:start w:val="1"/>
+      <w:numFmt w:val="bullet"/>
+      <w:lvlText w:val=""/>
+      <w:lvlJc w:val="left"/>
+      <w:pPr>
+        <w:tabs>
+          <w:tab w:val="num" w:pos="2160"/>
+        </w:tabs>
+        <w:ind w:left="2160" w:hanging="360"/>
+      </w:pPr>
+      <w:rPr>
+        <w:rFonts w:ascii="Wingdings" w:hAnsi="Wingdings" w:hint="default"/>
+        <w:sz w:val="20"/>
+      </w:rPr>
+    </w:lvl>
+    <w:lvl w:ilvl="3" w:tentative="1">
+      <w:start w:val="1"/>
+      <w:numFmt w:val="bullet"/>
+      <w:lvlText w:val=""/>
+      <w:lvlJc w:val="left"/>
+      <w:pPr>
+        <w:tabs>
+          <w:tab w:val="num" w:pos="2880"/>
+        </w:tabs>
+        <w:ind w:left="2880" w:hanging="360"/>
+      </w:pPr>
+      <w:rPr>
+        <w:rFonts w:ascii="Wingdings" w:hAnsi="Wingdings" w:hint="default"/>
+        <w:sz w:val="20"/>
+      </w:rPr>
+    </w:lvl>
+    <w:lvl w:ilvl="4" w:tentative="1">
+      <w:start w:val="1"/>
+      <w:numFmt w:val="bullet"/>
+      <w:lvlText w:val=""/>
+      <w:lvlJc w:val="left"/>
+      <w:pPr>
+        <w:tabs>
+          <w:tab w:val="num" w:pos="3600"/>
+        </w:tabs>
+        <w:ind w:left="3600" w:hanging="360"/>
+      </w:pPr>
+      <w:rPr>
+        <w:rFonts w:ascii="Wingdings" w:hAnsi="Wingdings" w:hint="default"/>
+        <w:sz w:val="20"/>
+      </w:rPr>
+    </w:lvl>
+    <w:lvl w:ilvl="5" w:tentative="1">
+      <w:start w:val="1"/>
+      <w:numFmt w:val="bullet"/>
+      <w:lvlText w:val=""/>
+      <w:lvlJc w:val="left"/>
+      <w:pPr>
+        <w:tabs>
+          <w:tab w:val="num" w:pos="4320"/>
+        </w:tabs>
+        <w:ind w:left="4320" w:hanging="360"/>
+      </w:pPr>
+      <w:rPr>
+        <w:rFonts w:ascii="Wingdings" w:hAnsi="Wingdings" w:hint="default"/>
+        <w:sz w:val="20"/>
+      </w:rPr>
+    </w:lvl>
+    <w:lvl w:ilvl="6" w:tentative="1">
+      <w:start w:val="1"/>
+      <w:numFmt w:val="bullet"/>
+      <w:lvlText w:val=""/>
+      <w:lvlJc w:val="left"/>
+      <w:pPr>
+        <w:tabs>
+          <w:tab w:val="num" w:pos="5040"/>
+        </w:tabs>
+        <w:ind w:left="5040" w:hanging="360"/>
+      </w:pPr>
+      <w:rPr>
+        <w:rFonts w:ascii="Wingdings" w:hAnsi="Wingdings" w:hint="default"/>
+        <w:sz w:val="20"/>
+      </w:rPr>
+    </w:lvl>
+    <w:lvl w:ilvl="7" w:tentative="1">
+      <w:start w:val="1"/>
+      <w:numFmt w:val="bullet"/>
+      <w:lvlText w:val=""/>
+      <w:lvlJc w:val="left"/>
+      <w:pPr>
+        <w:tabs>
+          <w:tab w:val="num" w:pos="5760"/>
+        </w:tabs>
+        <w:ind w:left="5760" w:hanging="360"/>
+      </w:pPr>
+      <w:rPr>
+        <w:rFonts w:ascii="Wingdings" w:hAnsi="Wingdings" w:hint="default"/>
+        <w:sz w:val="20"/>
+      </w:rPr>
+    </w:lvl>
+    <w:lvl w:ilvl="8" w:tentative="1">
+      <w:start w:val="1"/>
+      <w:numFmt w:val="bullet"/>
+      <w:lvlText w:val=""/>
+      <w:lvlJc w:val="left"/>
+      <w:pPr>
+        <w:tabs>
+          <w:tab w:val="num" w:pos="6480"/>
+        </w:tabs>
+        <w:ind w:left="6480" w:hanging="360"/>
+      </w:pPr>
+      <w:rPr>
+        <w:rFonts w:ascii="Wingdings" w:hAnsi="Wingdings" w:hint="default"/>
+        <w:sz w:val="20"/>
+      </w:rPr>
+    </w:lvl>
+  </w:abstractNum>
+  <w:abstractNum w:abstractNumId="15" w15:restartNumberingAfterBreak="0">
     <w:nsid w:val="1FF77926"/>
     <w:multiLevelType w:val="multilevel"/>
     <w:tmpl w:val="0A80441A"/>
@@ -12694,7 +13263,7 @@
       </w:rPr>
     </w:lvl>
   </w:abstractNum>
-  <w:abstractNum w:abstractNumId="15" w15:restartNumberingAfterBreak="0">
+  <w:abstractNum w:abstractNumId="16" w15:restartNumberingAfterBreak="0">
     <w:nsid w:val="20C5566A"/>
     <w:multiLevelType w:val="multilevel"/>
     <w:tmpl w:val="C9BE19CA"/>
@@ -12843,7 +13412,7 @@
       </w:rPr>
     </w:lvl>
   </w:abstractNum>
-  <w:abstractNum w:abstractNumId="16" w15:restartNumberingAfterBreak="0">
+  <w:abstractNum w:abstractNumId="17" w15:restartNumberingAfterBreak="0">
     <w:nsid w:val="20E6532F"/>
     <w:multiLevelType w:val="multilevel"/>
     <w:tmpl w:val="0CC6501C"/>
@@ -12992,7 +13561,7 @@
       </w:rPr>
     </w:lvl>
   </w:abstractNum>
-  <w:abstractNum w:abstractNumId="17" w15:restartNumberingAfterBreak="0">
+  <w:abstractNum w:abstractNumId="18" w15:restartNumberingAfterBreak="0">
     <w:nsid w:val="220C5546"/>
     <w:multiLevelType w:val="multilevel"/>
     <w:tmpl w:val="695EB55E"/>
@@ -13141,7 +13710,7 @@
       </w:rPr>
     </w:lvl>
   </w:abstractNum>
-  <w:abstractNum w:abstractNumId="18" w15:restartNumberingAfterBreak="0">
+  <w:abstractNum w:abstractNumId="19" w15:restartNumberingAfterBreak="0">
     <w:nsid w:val="24EF27FC"/>
     <w:multiLevelType w:val="multilevel"/>
     <w:tmpl w:val="48A4492E"/>
@@ -13254,7 +13823,7 @@
       </w:pPr>
     </w:lvl>
   </w:abstractNum>
-  <w:abstractNum w:abstractNumId="19" w15:restartNumberingAfterBreak="0">
+  <w:abstractNum w:abstractNumId="20" w15:restartNumberingAfterBreak="0">
     <w:nsid w:val="26497B09"/>
     <w:multiLevelType w:val="multilevel"/>
     <w:tmpl w:val="A72499CE"/>
@@ -13403,7 +13972,7 @@
       </w:rPr>
     </w:lvl>
   </w:abstractNum>
-  <w:abstractNum w:abstractNumId="20" w15:restartNumberingAfterBreak="0">
+  <w:abstractNum w:abstractNumId="21" w15:restartNumberingAfterBreak="0">
     <w:nsid w:val="28B15219"/>
     <w:multiLevelType w:val="multilevel"/>
     <w:tmpl w:val="7B5CE69E"/>
@@ -13552,7 +14121,7 @@
       </w:rPr>
     </w:lvl>
   </w:abstractNum>
-  <w:abstractNum w:abstractNumId="21" w15:restartNumberingAfterBreak="0">
+  <w:abstractNum w:abstractNumId="22" w15:restartNumberingAfterBreak="0">
     <w:nsid w:val="298F036B"/>
     <w:multiLevelType w:val="multilevel"/>
     <w:tmpl w:val="98322C26"/>
@@ -13701,7 +14270,7 @@
       </w:rPr>
     </w:lvl>
   </w:abstractNum>
-  <w:abstractNum w:abstractNumId="22" w15:restartNumberingAfterBreak="0">
+  <w:abstractNum w:abstractNumId="23" w15:restartNumberingAfterBreak="0">
     <w:nsid w:val="2C6441E9"/>
     <w:multiLevelType w:val="multilevel"/>
     <w:tmpl w:val="9402BCD0"/>
@@ -13850,7 +14419,7 @@
       </w:rPr>
     </w:lvl>
   </w:abstractNum>
-  <w:abstractNum w:abstractNumId="23" w15:restartNumberingAfterBreak="0">
+  <w:abstractNum w:abstractNumId="24" w15:restartNumberingAfterBreak="0">
     <w:nsid w:val="2D11164A"/>
     <w:multiLevelType w:val="multilevel"/>
     <w:tmpl w:val="7B642080"/>
@@ -13999,7 +14568,7 @@
       </w:rPr>
     </w:lvl>
   </w:abstractNum>
-  <w:abstractNum w:abstractNumId="24" w15:restartNumberingAfterBreak="0">
+  <w:abstractNum w:abstractNumId="25" w15:restartNumberingAfterBreak="0">
     <w:nsid w:val="30166F86"/>
     <w:multiLevelType w:val="multilevel"/>
     <w:tmpl w:val="5B622410"/>
@@ -14148,7 +14717,156 @@
       </w:rPr>
     </w:lvl>
   </w:abstractNum>
-  <w:abstractNum w:abstractNumId="25" w15:restartNumberingAfterBreak="0">
+  <w:abstractNum w:abstractNumId="26" w15:restartNumberingAfterBreak="0">
+    <w:nsid w:val="317D4AC9"/>
+    <w:multiLevelType w:val="multilevel"/>
+    <w:tmpl w:val="83D61D62"/>
+    <w:lvl w:ilvl="0">
+      <w:start w:val="1"/>
+      <w:numFmt w:val="bullet"/>
+      <w:lvlText w:val=""/>
+      <w:lvlJc w:val="left"/>
+      <w:pPr>
+        <w:tabs>
+          <w:tab w:val="num" w:pos="720"/>
+        </w:tabs>
+        <w:ind w:left="720" w:hanging="360"/>
+      </w:pPr>
+      <w:rPr>
+        <w:rFonts w:ascii="Symbol" w:hAnsi="Symbol" w:hint="default"/>
+        <w:sz w:val="20"/>
+      </w:rPr>
+    </w:lvl>
+    <w:lvl w:ilvl="1">
+      <w:start w:val="1"/>
+      <w:numFmt w:val="bullet"/>
+      <w:lvlText w:val="o"/>
+      <w:lvlJc w:val="left"/>
+      <w:pPr>
+        <w:tabs>
+          <w:tab w:val="num" w:pos="1440"/>
+        </w:tabs>
+        <w:ind w:left="1440" w:hanging="360"/>
+      </w:pPr>
+      <w:rPr>
+        <w:rFonts w:ascii="Courier New" w:hAnsi="Courier New" w:hint="default"/>
+        <w:sz w:val="20"/>
+      </w:rPr>
+    </w:lvl>
+    <w:lvl w:ilvl="2" w:tentative="1">
+      <w:start w:val="1"/>
+      <w:numFmt w:val="bullet"/>
+      <w:lvlText w:val=""/>
+      <w:lvlJc w:val="left"/>
+      <w:pPr>
+        <w:tabs>
+          <w:tab w:val="num" w:pos="2160"/>
+        </w:tabs>
+        <w:ind w:left="2160" w:hanging="360"/>
+      </w:pPr>
+      <w:rPr>
+        <w:rFonts w:ascii="Wingdings" w:hAnsi="Wingdings" w:hint="default"/>
+        <w:sz w:val="20"/>
+      </w:rPr>
+    </w:lvl>
+    <w:lvl w:ilvl="3" w:tentative="1">
+      <w:start w:val="1"/>
+      <w:numFmt w:val="bullet"/>
+      <w:lvlText w:val=""/>
+      <w:lvlJc w:val="left"/>
+      <w:pPr>
+        <w:tabs>
+          <w:tab w:val="num" w:pos="2880"/>
+        </w:tabs>
+        <w:ind w:left="2880" w:hanging="360"/>
+      </w:pPr>
+      <w:rPr>
+        <w:rFonts w:ascii="Wingdings" w:hAnsi="Wingdings" w:hint="default"/>
+        <w:sz w:val="20"/>
+      </w:rPr>
+    </w:lvl>
+    <w:lvl w:ilvl="4" w:tentative="1">
+      <w:start w:val="1"/>
+      <w:numFmt w:val="bullet"/>
+      <w:lvlText w:val=""/>
+      <w:lvlJc w:val="left"/>
+      <w:pPr>
+        <w:tabs>
+          <w:tab w:val="num" w:pos="3600"/>
+        </w:tabs>
+        <w:ind w:left="3600" w:hanging="360"/>
+      </w:pPr>
+      <w:rPr>
+        <w:rFonts w:ascii="Wingdings" w:hAnsi="Wingdings" w:hint="default"/>
+        <w:sz w:val="20"/>
+      </w:rPr>
+    </w:lvl>
+    <w:lvl w:ilvl="5" w:tentative="1">
+      <w:start w:val="1"/>
+      <w:numFmt w:val="bullet"/>
+      <w:lvlText w:val=""/>
+      <w:lvlJc w:val="left"/>
+      <w:pPr>
+        <w:tabs>
+          <w:tab w:val="num" w:pos="4320"/>
+        </w:tabs>
+        <w:ind w:left="4320" w:hanging="360"/>
+      </w:pPr>
+      <w:rPr>
+        <w:rFonts w:ascii="Wingdings" w:hAnsi="Wingdings" w:hint="default"/>
+        <w:sz w:val="20"/>
+      </w:rPr>
+    </w:lvl>
+    <w:lvl w:ilvl="6" w:tentative="1">
+      <w:start w:val="1"/>
+      <w:numFmt w:val="bullet"/>
+      <w:lvlText w:val=""/>
+      <w:lvlJc w:val="left"/>
+      <w:pPr>
+        <w:tabs>
+          <w:tab w:val="num" w:pos="5040"/>
+        </w:tabs>
+        <w:ind w:left="5040" w:hanging="360"/>
+      </w:pPr>
+      <w:rPr>
+        <w:rFonts w:ascii="Wingdings" w:hAnsi="Wingdings" w:hint="default"/>
+        <w:sz w:val="20"/>
+      </w:rPr>
+    </w:lvl>
+    <w:lvl w:ilvl="7" w:tentative="1">
+      <w:start w:val="1"/>
+      <w:numFmt w:val="bullet"/>
+      <w:lvlText w:val=""/>
+      <w:lvlJc w:val="left"/>
+      <w:pPr>
+        <w:tabs>
+          <w:tab w:val="num" w:pos="5760"/>
+        </w:tabs>
+        <w:ind w:left="5760" w:hanging="360"/>
+      </w:pPr>
+      <w:rPr>
+        <w:rFonts w:ascii="Wingdings" w:hAnsi="Wingdings" w:hint="default"/>
+        <w:sz w:val="20"/>
+      </w:rPr>
+    </w:lvl>
+    <w:lvl w:ilvl="8" w:tentative="1">
+      <w:start w:val="1"/>
+      <w:numFmt w:val="bullet"/>
+      <w:lvlText w:val=""/>
+      <w:lvlJc w:val="left"/>
+      <w:pPr>
+        <w:tabs>
+          <w:tab w:val="num" w:pos="6480"/>
+        </w:tabs>
+        <w:ind w:left="6480" w:hanging="360"/>
+      </w:pPr>
+      <w:rPr>
+        <w:rFonts w:ascii="Wingdings" w:hAnsi="Wingdings" w:hint="default"/>
+        <w:sz w:val="20"/>
+      </w:rPr>
+    </w:lvl>
+  </w:abstractNum>
+  <w:abstractNum w:abstractNumId="27" w15:restartNumberingAfterBreak="0">
     <w:nsid w:val="32E9407F"/>
     <w:multiLevelType w:val="multilevel"/>
     <w:tmpl w:val="F960878A"/>
@@ -14297,7 +15015,7 @@
       </w:rPr>
     </w:lvl>
   </w:abstractNum>
-  <w:abstractNum w:abstractNumId="26" w15:restartNumberingAfterBreak="0">
+  <w:abstractNum w:abstractNumId="28" w15:restartNumberingAfterBreak="0">
     <w:nsid w:val="36605150"/>
     <w:multiLevelType w:val="multilevel"/>
     <w:tmpl w:val="6BECC826"/>
@@ -14446,7 +15164,7 @@
       </w:rPr>
     </w:lvl>
   </w:abstractNum>
-  <w:abstractNum w:abstractNumId="27" w15:restartNumberingAfterBreak="0">
+  <w:abstractNum w:abstractNumId="29" w15:restartNumberingAfterBreak="0">
     <w:nsid w:val="3B376311"/>
     <w:multiLevelType w:val="multilevel"/>
     <w:tmpl w:val="9C0A9946"/>
@@ -14559,7 +15277,7 @@
       </w:pPr>
     </w:lvl>
   </w:abstractNum>
-  <w:abstractNum w:abstractNumId="28" w15:restartNumberingAfterBreak="0">
+  <w:abstractNum w:abstractNumId="30" w15:restartNumberingAfterBreak="0">
     <w:nsid w:val="3C967E84"/>
     <w:multiLevelType w:val="multilevel"/>
     <w:tmpl w:val="A926C55E"/>
@@ -14708,7 +15426,7 @@
       </w:rPr>
     </w:lvl>
   </w:abstractNum>
-  <w:abstractNum w:abstractNumId="29" w15:restartNumberingAfterBreak="0">
+  <w:abstractNum w:abstractNumId="31" w15:restartNumberingAfterBreak="0">
     <w:nsid w:val="3F3519BA"/>
     <w:multiLevelType w:val="multilevel"/>
     <w:tmpl w:val="366E9F3C"/>
@@ -14857,7 +15575,156 @@
       </w:rPr>
     </w:lvl>
   </w:abstractNum>
-  <w:abstractNum w:abstractNumId="30" w15:restartNumberingAfterBreak="0">
+  <w:abstractNum w:abstractNumId="32" w15:restartNumberingAfterBreak="0">
+    <w:nsid w:val="40DE5268"/>
+    <w:multiLevelType w:val="multilevel"/>
+    <w:tmpl w:val="70F01292"/>
+    <w:lvl w:ilvl="0">
+      <w:start w:val="1"/>
+      <w:numFmt w:val="bullet"/>
+      <w:lvlText w:val=""/>
+      <w:lvlJc w:val="left"/>
+      <w:pPr>
+        <w:tabs>
+          <w:tab w:val="num" w:pos="720"/>
+        </w:tabs>
+        <w:ind w:left="720" w:hanging="360"/>
+      </w:pPr>
+      <w:rPr>
+        <w:rFonts w:ascii="Symbol" w:hAnsi="Symbol" w:hint="default"/>
+        <w:sz w:val="20"/>
+      </w:rPr>
+    </w:lvl>
+    <w:lvl w:ilvl="1" w:tentative="1">
+      <w:start w:val="1"/>
+      <w:numFmt w:val="bullet"/>
+      <w:lvlText w:val="o"/>
+      <w:lvlJc w:val="left"/>
+      <w:pPr>
+        <w:tabs>
+          <w:tab w:val="num" w:pos="1440"/>
+        </w:tabs>
+        <w:ind w:left="1440" w:hanging="360"/>
+      </w:pPr>
+      <w:rPr>
+        <w:rFonts w:ascii="Courier New" w:hAnsi="Courier New" w:hint="default"/>
+        <w:sz w:val="20"/>
+      </w:rPr>
+    </w:lvl>
+    <w:lvl w:ilvl="2" w:tentative="1">
+      <w:start w:val="1"/>
+      <w:numFmt w:val="bullet"/>
+      <w:lvlText w:val=""/>
+      <w:lvlJc w:val="left"/>
+      <w:pPr>
+        <w:tabs>
+          <w:tab w:val="num" w:pos="2160"/>
+        </w:tabs>
+        <w:ind w:left="2160" w:hanging="360"/>
+      </w:pPr>
+      <w:rPr>
+        <w:rFonts w:ascii="Wingdings" w:hAnsi="Wingdings" w:hint="default"/>
+        <w:sz w:val="20"/>
+      </w:rPr>
+    </w:lvl>
+    <w:lvl w:ilvl="3" w:tentative="1">
+      <w:start w:val="1"/>
+      <w:numFmt w:val="bullet"/>
+      <w:lvlText w:val=""/>
+      <w:lvlJc w:val="left"/>
+      <w:pPr>
+        <w:tabs>
+          <w:tab w:val="num" w:pos="2880"/>
+        </w:tabs>
+        <w:ind w:left="2880" w:hanging="360"/>
+      </w:pPr>
+      <w:rPr>
+        <w:rFonts w:ascii="Wingdings" w:hAnsi="Wingdings" w:hint="default"/>
+        <w:sz w:val="20"/>
+      </w:rPr>
+    </w:lvl>
+    <w:lvl w:ilvl="4" w:tentative="1">
+      <w:start w:val="1"/>
+      <w:numFmt w:val="bullet"/>
+      <w:lvlText w:val=""/>
+      <w:lvlJc w:val="left"/>
+      <w:pPr>
+        <w:tabs>
+          <w:tab w:val="num" w:pos="3600"/>
+        </w:tabs>
+        <w:ind w:left="3600" w:hanging="360"/>
+      </w:pPr>
+      <w:rPr>
+        <w:rFonts w:ascii="Wingdings" w:hAnsi="Wingdings" w:hint="default"/>
+        <w:sz w:val="20"/>
+      </w:rPr>
+    </w:lvl>
+    <w:lvl w:ilvl="5" w:tentative="1">
+      <w:start w:val="1"/>
+      <w:numFmt w:val="bullet"/>
+      <w:lvlText w:val=""/>
+      <w:lvlJc w:val="left"/>
+      <w:pPr>
+        <w:tabs>
+          <w:tab w:val="num" w:pos="4320"/>
+        </w:tabs>
+        <w:ind w:left="4320" w:hanging="360"/>
+      </w:pPr>
+      <w:rPr>
+        <w:rFonts w:ascii="Wingdings" w:hAnsi="Wingdings" w:hint="default"/>
+        <w:sz w:val="20"/>
+      </w:rPr>
+    </w:lvl>
+    <w:lvl w:ilvl="6" w:tentative="1">
+      <w:start w:val="1"/>
+      <w:numFmt w:val="bullet"/>
+      <w:lvlText w:val=""/>
+      <w:lvlJc w:val="left"/>
+      <w:pPr>
+        <w:tabs>
+          <w:tab w:val="num" w:pos="5040"/>
+        </w:tabs>
+        <w:ind w:left="5040" w:hanging="360"/>
+      </w:pPr>
+      <w:rPr>
+        <w:rFonts w:ascii="Wingdings" w:hAnsi="Wingdings" w:hint="default"/>
+        <w:sz w:val="20"/>
+      </w:rPr>
+    </w:lvl>
+    <w:lvl w:ilvl="7" w:tentative="1">
+      <w:start w:val="1"/>
+      <w:numFmt w:val="bullet"/>
+      <w:lvlText w:val=""/>
+      <w:lvlJc w:val="left"/>
+      <w:pPr>
+        <w:tabs>
+          <w:tab w:val="num" w:pos="5760"/>
+        </w:tabs>
+        <w:ind w:left="5760" w:hanging="360"/>
+      </w:pPr>
+      <w:rPr>
+        <w:rFonts w:ascii="Wingdings" w:hAnsi="Wingdings" w:hint="default"/>
+        <w:sz w:val="20"/>
+      </w:rPr>
+    </w:lvl>
+    <w:lvl w:ilvl="8" w:tentative="1">
+      <w:start w:val="1"/>
+      <w:numFmt w:val="bullet"/>
+      <w:lvlText w:val=""/>
+      <w:lvlJc w:val="left"/>
+      <w:pPr>
+        <w:tabs>
+          <w:tab w:val="num" w:pos="6480"/>
+        </w:tabs>
+        <w:ind w:left="6480" w:hanging="360"/>
+      </w:pPr>
+      <w:rPr>
+        <w:rFonts w:ascii="Wingdings" w:hAnsi="Wingdings" w:hint="default"/>
+        <w:sz w:val="20"/>
+      </w:rPr>
+    </w:lvl>
+  </w:abstractNum>
+  <w:abstractNum w:abstractNumId="33" w15:restartNumberingAfterBreak="0">
     <w:nsid w:val="41115BB6"/>
     <w:multiLevelType w:val="multilevel"/>
     <w:tmpl w:val="4AEC9500"/>
@@ -15006,7 +15873,7 @@
       </w:rPr>
     </w:lvl>
   </w:abstractNum>
-  <w:abstractNum w:abstractNumId="31" w15:restartNumberingAfterBreak="0">
+  <w:abstractNum w:abstractNumId="34" w15:restartNumberingAfterBreak="0">
     <w:nsid w:val="434F6C41"/>
     <w:multiLevelType w:val="multilevel"/>
     <w:tmpl w:val="8CC87864"/>
@@ -15155,7 +16022,7 @@
       </w:rPr>
     </w:lvl>
   </w:abstractNum>
-  <w:abstractNum w:abstractNumId="32" w15:restartNumberingAfterBreak="0">
+  <w:abstractNum w:abstractNumId="35" w15:restartNumberingAfterBreak="0">
     <w:nsid w:val="47507BBB"/>
     <w:multiLevelType w:val="multilevel"/>
     <w:tmpl w:val="315CDF4A"/>
@@ -15304,7 +16171,7 @@
       </w:rPr>
     </w:lvl>
   </w:abstractNum>
-  <w:abstractNum w:abstractNumId="33" w15:restartNumberingAfterBreak="0">
+  <w:abstractNum w:abstractNumId="36" w15:restartNumberingAfterBreak="0">
     <w:nsid w:val="47AB1C43"/>
     <w:multiLevelType w:val="multilevel"/>
     <w:tmpl w:val="BB78718C"/>
@@ -15453,7 +16320,7 @@
       </w:rPr>
     </w:lvl>
   </w:abstractNum>
-  <w:abstractNum w:abstractNumId="34" w15:restartNumberingAfterBreak="0">
+  <w:abstractNum w:abstractNumId="37" w15:restartNumberingAfterBreak="0">
     <w:nsid w:val="4ABE1C0F"/>
     <w:multiLevelType w:val="multilevel"/>
     <w:tmpl w:val="6368F9C6"/>
@@ -15602,7 +16469,7 @@
       </w:rPr>
     </w:lvl>
   </w:abstractNum>
-  <w:abstractNum w:abstractNumId="35" w15:restartNumberingAfterBreak="0">
+  <w:abstractNum w:abstractNumId="38" w15:restartNumberingAfterBreak="0">
     <w:nsid w:val="4CA87E5E"/>
     <w:multiLevelType w:val="multilevel"/>
     <w:tmpl w:val="74FAFFF0"/>
@@ -15751,7 +16618,7 @@
       </w:rPr>
     </w:lvl>
   </w:abstractNum>
-  <w:abstractNum w:abstractNumId="36" w15:restartNumberingAfterBreak="0">
+  <w:abstractNum w:abstractNumId="39" w15:restartNumberingAfterBreak="0">
     <w:nsid w:val="51987115"/>
     <w:multiLevelType w:val="multilevel"/>
     <w:tmpl w:val="26BAF7C8"/>
@@ -15900,7 +16767,7 @@
       </w:rPr>
     </w:lvl>
   </w:abstractNum>
-  <w:abstractNum w:abstractNumId="37" w15:restartNumberingAfterBreak="0">
+  <w:abstractNum w:abstractNumId="40" w15:restartNumberingAfterBreak="0">
     <w:nsid w:val="53F06A2A"/>
     <w:multiLevelType w:val="multilevel"/>
     <w:tmpl w:val="31248CA0"/>
@@ -16017,7 +16884,7 @@
       </w:pPr>
     </w:lvl>
   </w:abstractNum>
-  <w:abstractNum w:abstractNumId="38" w15:restartNumberingAfterBreak="0">
+  <w:abstractNum w:abstractNumId="41" w15:restartNumberingAfterBreak="0">
     <w:nsid w:val="55125CC7"/>
     <w:multiLevelType w:val="multilevel"/>
     <w:tmpl w:val="0652B2B6"/>
@@ -16130,7 +16997,7 @@
       </w:pPr>
     </w:lvl>
   </w:abstractNum>
-  <w:abstractNum w:abstractNumId="39" w15:restartNumberingAfterBreak="0">
+  <w:abstractNum w:abstractNumId="42" w15:restartNumberingAfterBreak="0">
     <w:nsid w:val="56C16704"/>
     <w:multiLevelType w:val="multilevel"/>
     <w:tmpl w:val="83D025E6"/>
@@ -16243,7 +17110,7 @@
       </w:pPr>
     </w:lvl>
   </w:abstractNum>
-  <w:abstractNum w:abstractNumId="40" w15:restartNumberingAfterBreak="0">
+  <w:abstractNum w:abstractNumId="43" w15:restartNumberingAfterBreak="0">
     <w:nsid w:val="5F934E2E"/>
     <w:multiLevelType w:val="multilevel"/>
     <w:tmpl w:val="0A246416"/>
@@ -16392,7 +17259,7 @@
       </w:rPr>
     </w:lvl>
   </w:abstractNum>
-  <w:abstractNum w:abstractNumId="41" w15:restartNumberingAfterBreak="0">
+  <w:abstractNum w:abstractNumId="44" w15:restartNumberingAfterBreak="0">
     <w:nsid w:val="601E25EC"/>
     <w:multiLevelType w:val="multilevel"/>
     <w:tmpl w:val="324E1FF8"/>
@@ -16541,7 +17408,7 @@
       </w:rPr>
     </w:lvl>
   </w:abstractNum>
-  <w:abstractNum w:abstractNumId="42" w15:restartNumberingAfterBreak="0">
+  <w:abstractNum w:abstractNumId="45" w15:restartNumberingAfterBreak="0">
     <w:nsid w:val="602F235A"/>
     <w:multiLevelType w:val="multilevel"/>
     <w:tmpl w:val="D58E3B1A"/>
@@ -16690,7 +17557,7 @@
       </w:rPr>
     </w:lvl>
   </w:abstractNum>
-  <w:abstractNum w:abstractNumId="43" w15:restartNumberingAfterBreak="0">
+  <w:abstractNum w:abstractNumId="46" w15:restartNumberingAfterBreak="0">
     <w:nsid w:val="60AA330B"/>
     <w:multiLevelType w:val="multilevel"/>
     <w:tmpl w:val="F1C4B0DA"/>
@@ -16803,7 +17670,7 @@
       </w:pPr>
     </w:lvl>
   </w:abstractNum>
-  <w:abstractNum w:abstractNumId="44" w15:restartNumberingAfterBreak="0">
+  <w:abstractNum w:abstractNumId="47" w15:restartNumberingAfterBreak="0">
     <w:nsid w:val="60E928F1"/>
     <w:multiLevelType w:val="multilevel"/>
     <w:tmpl w:val="A35ED67A"/>
@@ -16952,7 +17819,7 @@
       </w:rPr>
     </w:lvl>
   </w:abstractNum>
-  <w:abstractNum w:abstractNumId="45" w15:restartNumberingAfterBreak="0">
+  <w:abstractNum w:abstractNumId="48" w15:restartNumberingAfterBreak="0">
     <w:nsid w:val="616A7C9B"/>
     <w:multiLevelType w:val="multilevel"/>
     <w:tmpl w:val="12EE9EB2"/>
@@ -17101,7 +17968,7 @@
       </w:rPr>
     </w:lvl>
   </w:abstractNum>
-  <w:abstractNum w:abstractNumId="46" w15:restartNumberingAfterBreak="0">
+  <w:abstractNum w:abstractNumId="49" w15:restartNumberingAfterBreak="0">
     <w:nsid w:val="617D52CE"/>
     <w:multiLevelType w:val="multilevel"/>
     <w:tmpl w:val="BC4C6774"/>
@@ -17250,7 +18117,7 @@
       </w:rPr>
     </w:lvl>
   </w:abstractNum>
-  <w:abstractNum w:abstractNumId="47" w15:restartNumberingAfterBreak="0">
+  <w:abstractNum w:abstractNumId="50" w15:restartNumberingAfterBreak="0">
     <w:nsid w:val="64281BEF"/>
     <w:multiLevelType w:val="multilevel"/>
     <w:tmpl w:val="BE52E18C"/>
@@ -17399,7 +18266,7 @@
       </w:rPr>
     </w:lvl>
   </w:abstractNum>
-  <w:abstractNum w:abstractNumId="48" w15:restartNumberingAfterBreak="0">
+  <w:abstractNum w:abstractNumId="51" w15:restartNumberingAfterBreak="0">
     <w:nsid w:val="66A230CC"/>
     <w:multiLevelType w:val="multilevel"/>
     <w:tmpl w:val="61E2A87A"/>
@@ -17548,7 +18415,7 @@
       </w:rPr>
     </w:lvl>
   </w:abstractNum>
-  <w:abstractNum w:abstractNumId="49" w15:restartNumberingAfterBreak="0">
+  <w:abstractNum w:abstractNumId="52" w15:restartNumberingAfterBreak="0">
     <w:nsid w:val="6739552B"/>
     <w:multiLevelType w:val="multilevel"/>
     <w:tmpl w:val="363E387C"/>
@@ -17697,7 +18564,7 @@
       </w:rPr>
     </w:lvl>
   </w:abstractNum>
-  <w:abstractNum w:abstractNumId="50" w15:restartNumberingAfterBreak="0">
+  <w:abstractNum w:abstractNumId="53" w15:restartNumberingAfterBreak="0">
     <w:nsid w:val="68EF68FF"/>
     <w:multiLevelType w:val="multilevel"/>
     <w:tmpl w:val="A8D45C22"/>
@@ -17846,7 +18713,7 @@
       </w:rPr>
     </w:lvl>
   </w:abstractNum>
-  <w:abstractNum w:abstractNumId="51" w15:restartNumberingAfterBreak="0">
+  <w:abstractNum w:abstractNumId="54" w15:restartNumberingAfterBreak="0">
     <w:nsid w:val="6B7C4451"/>
     <w:multiLevelType w:val="multilevel"/>
     <w:tmpl w:val="3F646B3C"/>
@@ -17995,7 +18862,7 @@
       </w:rPr>
     </w:lvl>
   </w:abstractNum>
-  <w:abstractNum w:abstractNumId="52" w15:restartNumberingAfterBreak="0">
+  <w:abstractNum w:abstractNumId="55" w15:restartNumberingAfterBreak="0">
     <w:nsid w:val="732368BF"/>
     <w:multiLevelType w:val="multilevel"/>
     <w:tmpl w:val="66A08136"/>
@@ -18144,7 +19011,7 @@
       </w:rPr>
     </w:lvl>
   </w:abstractNum>
-  <w:abstractNum w:abstractNumId="53" w15:restartNumberingAfterBreak="0">
+  <w:abstractNum w:abstractNumId="56" w15:restartNumberingAfterBreak="0">
     <w:nsid w:val="758E0AD4"/>
     <w:multiLevelType w:val="hybridMultilevel"/>
     <w:tmpl w:val="1DBC1E18"/>
@@ -18259,7 +19126,7 @@
       </w:rPr>
     </w:lvl>
   </w:abstractNum>
-  <w:abstractNum w:abstractNumId="54" w15:restartNumberingAfterBreak="0">
+  <w:abstractNum w:abstractNumId="57" w15:restartNumberingAfterBreak="0">
     <w:nsid w:val="796E39C1"/>
     <w:multiLevelType w:val="multilevel"/>
     <w:tmpl w:val="D5E8DFF4"/>
@@ -18408,7 +19275,7 @@
       </w:rPr>
     </w:lvl>
   </w:abstractNum>
-  <w:abstractNum w:abstractNumId="55" w15:restartNumberingAfterBreak="0">
+  <w:abstractNum w:abstractNumId="58" w15:restartNumberingAfterBreak="0">
     <w:nsid w:val="7A8B687A"/>
     <w:multiLevelType w:val="hybridMultilevel"/>
     <w:tmpl w:val="C47EB558"/>
@@ -18521,7 +19388,7 @@
       </w:rPr>
     </w:lvl>
   </w:abstractNum>
-  <w:abstractNum w:abstractNumId="56" w15:restartNumberingAfterBreak="0">
+  <w:abstractNum w:abstractNumId="59" w15:restartNumberingAfterBreak="0">
     <w:nsid w:val="7D627E0E"/>
     <w:multiLevelType w:val="multilevel"/>
     <w:tmpl w:val="6C184EB4"/>
@@ -18670,7 +19537,7 @@
       </w:rPr>
     </w:lvl>
   </w:abstractNum>
-  <w:abstractNum w:abstractNumId="57" w15:restartNumberingAfterBreak="0">
+  <w:abstractNum w:abstractNumId="60" w15:restartNumberingAfterBreak="0">
     <w:nsid w:val="7DC1288F"/>
     <w:multiLevelType w:val="multilevel"/>
     <w:tmpl w:val="5C3028AC"/>
@@ -18819,7 +19686,7 @@
       </w:rPr>
     </w:lvl>
   </w:abstractNum>
-  <w:abstractNum w:abstractNumId="58" w15:restartNumberingAfterBreak="0">
+  <w:abstractNum w:abstractNumId="61" w15:restartNumberingAfterBreak="0">
     <w:nsid w:val="7FF475C3"/>
     <w:multiLevelType w:val="multilevel"/>
     <w:tmpl w:val="0FD25438"/>
@@ -18933,151 +19800,151 @@
     </w:lvl>
   </w:abstractNum>
   <w:num w:numId="1" w16cid:durableId="984704842">
-    <w:abstractNumId w:val="37"/>
+    <w:abstractNumId w:val="40"/>
   </w:num>
   <w:num w:numId="2" w16cid:durableId="648873920">
-    <w:abstractNumId w:val="53"/>
+    <w:abstractNumId w:val="56"/>
   </w:num>
   <w:num w:numId="3" w16cid:durableId="290551785">
-    <w:abstractNumId w:val="54"/>
+    <w:abstractNumId w:val="57"/>
   </w:num>
   <w:num w:numId="4" w16cid:durableId="620847743">
     <w:abstractNumId w:val="0"/>
   </w:num>
   <w:num w:numId="5" w16cid:durableId="1912885357">
-    <w:abstractNumId w:val="42"/>
+    <w:abstractNumId w:val="45"/>
   </w:num>
   <w:num w:numId="6" w16cid:durableId="161436335">
-    <w:abstractNumId w:val="14"/>
+    <w:abstractNumId w:val="15"/>
   </w:num>
   <w:num w:numId="7" w16cid:durableId="536742505">
-    <w:abstractNumId w:val="29"/>
+    <w:abstractNumId w:val="31"/>
   </w:num>
   <w:num w:numId="8" w16cid:durableId="1242524266">
     <w:abstractNumId w:val="2"/>
   </w:num>
   <w:num w:numId="9" w16cid:durableId="1130200612">
-    <w:abstractNumId w:val="27"/>
+    <w:abstractNumId w:val="29"/>
   </w:num>
   <w:num w:numId="10" w16cid:durableId="1760641693">
-    <w:abstractNumId w:val="56"/>
+    <w:abstractNumId w:val="59"/>
   </w:num>
   <w:num w:numId="11" w16cid:durableId="867328068">
-    <w:abstractNumId w:val="38"/>
+    <w:abstractNumId w:val="41"/>
   </w:num>
   <w:num w:numId="12" w16cid:durableId="1584028168">
-    <w:abstractNumId w:val="48"/>
+    <w:abstractNumId w:val="51"/>
   </w:num>
   <w:num w:numId="13" w16cid:durableId="288702568">
-    <w:abstractNumId w:val="28"/>
+    <w:abstractNumId w:val="30"/>
   </w:num>
   <w:num w:numId="14" w16cid:durableId="609437052">
     <w:abstractNumId w:val="11"/>
   </w:num>
   <w:num w:numId="15" w16cid:durableId="318508567">
-    <w:abstractNumId w:val="46"/>
+    <w:abstractNumId w:val="49"/>
   </w:num>
   <w:num w:numId="16" w16cid:durableId="287979788">
-    <w:abstractNumId w:val="23"/>
+    <w:abstractNumId w:val="24"/>
   </w:num>
   <w:num w:numId="17" w16cid:durableId="1017735308">
-    <w:abstractNumId w:val="33"/>
+    <w:abstractNumId w:val="36"/>
   </w:num>
   <w:num w:numId="18" w16cid:durableId="665285770">
     <w:abstractNumId w:val="9"/>
   </w:num>
   <w:num w:numId="19" w16cid:durableId="2141415972">
-    <w:abstractNumId w:val="19"/>
+    <w:abstractNumId w:val="20"/>
   </w:num>
   <w:num w:numId="20" w16cid:durableId="1929343649">
-    <w:abstractNumId w:val="26"/>
+    <w:abstractNumId w:val="28"/>
   </w:num>
   <w:num w:numId="21" w16cid:durableId="943154593">
-    <w:abstractNumId w:val="36"/>
+    <w:abstractNumId w:val="39"/>
   </w:num>
   <w:num w:numId="22" w16cid:durableId="366562368">
-    <w:abstractNumId w:val="22"/>
+    <w:abstractNumId w:val="23"/>
   </w:num>
   <w:num w:numId="23" w16cid:durableId="1427969003">
     <w:abstractNumId w:val="4"/>
   </w:num>
   <w:num w:numId="24" w16cid:durableId="523136213">
-    <w:abstractNumId w:val="35"/>
+    <w:abstractNumId w:val="38"/>
   </w:num>
   <w:num w:numId="25" w16cid:durableId="1401322893">
     <w:abstractNumId w:val="5"/>
   </w:num>
   <w:num w:numId="26" w16cid:durableId="519469021">
-    <w:abstractNumId w:val="51"/>
+    <w:abstractNumId w:val="54"/>
   </w:num>
   <w:num w:numId="27" w16cid:durableId="1308634790">
-    <w:abstractNumId w:val="16"/>
+    <w:abstractNumId w:val="17"/>
   </w:num>
   <w:num w:numId="28" w16cid:durableId="1046179783">
-    <w:abstractNumId w:val="44"/>
+    <w:abstractNumId w:val="47"/>
   </w:num>
   <w:num w:numId="29" w16cid:durableId="1964189386">
-    <w:abstractNumId w:val="50"/>
+    <w:abstractNumId w:val="53"/>
   </w:num>
   <w:num w:numId="30" w16cid:durableId="179048059">
-    <w:abstractNumId w:val="31"/>
+    <w:abstractNumId w:val="34"/>
   </w:num>
   <w:num w:numId="31" w16cid:durableId="1749767622">
-    <w:abstractNumId w:val="24"/>
+    <w:abstractNumId w:val="25"/>
   </w:num>
   <w:num w:numId="32" w16cid:durableId="501362686">
-    <w:abstractNumId w:val="39"/>
+    <w:abstractNumId w:val="42"/>
   </w:num>
   <w:num w:numId="33" w16cid:durableId="345669116">
-    <w:abstractNumId w:val="40"/>
+    <w:abstractNumId w:val="43"/>
   </w:num>
   <w:num w:numId="34" w16cid:durableId="2113934101">
     <w:abstractNumId w:val="3"/>
   </w:num>
   <w:num w:numId="35" w16cid:durableId="1744377228">
-    <w:abstractNumId w:val="32"/>
+    <w:abstractNumId w:val="35"/>
   </w:num>
   <w:num w:numId="36" w16cid:durableId="1831823628">
-    <w:abstractNumId w:val="41"/>
+    <w:abstractNumId w:val="44"/>
   </w:num>
   <w:num w:numId="37" w16cid:durableId="1475638895">
-    <w:abstractNumId w:val="30"/>
+    <w:abstractNumId w:val="33"/>
   </w:num>
   <w:num w:numId="38" w16cid:durableId="1428772041">
-    <w:abstractNumId w:val="45"/>
+    <w:abstractNumId w:val="48"/>
   </w:num>
   <w:num w:numId="39" w16cid:durableId="662127270">
-    <w:abstractNumId w:val="43"/>
+    <w:abstractNumId w:val="46"/>
   </w:num>
   <w:num w:numId="40" w16cid:durableId="230502713">
-    <w:abstractNumId w:val="21"/>
+    <w:abstractNumId w:val="22"/>
   </w:num>
   <w:num w:numId="41" w16cid:durableId="375201722">
     <w:abstractNumId w:val="8"/>
   </w:num>
   <w:num w:numId="42" w16cid:durableId="504367277">
-    <w:abstractNumId w:val="49"/>
+    <w:abstractNumId w:val="52"/>
   </w:num>
   <w:num w:numId="43" w16cid:durableId="971331413">
-    <w:abstractNumId w:val="52"/>
+    <w:abstractNumId w:val="55"/>
   </w:num>
   <w:num w:numId="44" w16cid:durableId="1822959970">
-    <w:abstractNumId w:val="15"/>
+    <w:abstractNumId w:val="16"/>
   </w:num>
   <w:num w:numId="45" w16cid:durableId="1772432833">
-    <w:abstractNumId w:val="34"/>
+    <w:abstractNumId w:val="37"/>
   </w:num>
   <w:num w:numId="46" w16cid:durableId="573861204">
-    <w:abstractNumId w:val="58"/>
+    <w:abstractNumId w:val="61"/>
   </w:num>
   <w:num w:numId="47" w16cid:durableId="1745830856">
-    <w:abstractNumId w:val="57"/>
+    <w:abstractNumId w:val="60"/>
   </w:num>
   <w:num w:numId="48" w16cid:durableId="1170025613">
-    <w:abstractNumId w:val="17"/>
+    <w:abstractNumId w:val="18"/>
   </w:num>
   <w:num w:numId="49" w16cid:durableId="994452919">
-    <w:abstractNumId w:val="47"/>
+    <w:abstractNumId w:val="50"/>
   </w:num>
   <w:num w:numId="50" w16cid:durableId="2075271656">
     <w:abstractNumId w:val="6"/>
@@ -19086,7 +19953,7 @@
     <w:abstractNumId w:val="1"/>
   </w:num>
   <w:num w:numId="52" w16cid:durableId="1974753569">
-    <w:abstractNumId w:val="18"/>
+    <w:abstractNumId w:val="19"/>
   </w:num>
   <w:num w:numId="53" w16cid:durableId="530000418">
     <w:abstractNumId w:val="12"/>
@@ -19095,19 +19962,28 @@
     <w:abstractNumId w:val="10"/>
   </w:num>
   <w:num w:numId="55" w16cid:durableId="1976326184">
-    <w:abstractNumId w:val="20"/>
+    <w:abstractNumId w:val="21"/>
   </w:num>
   <w:num w:numId="56" w16cid:durableId="715742882">
-    <w:abstractNumId w:val="25"/>
+    <w:abstractNumId w:val="27"/>
   </w:num>
   <w:num w:numId="57" w16cid:durableId="977221772">
     <w:abstractNumId w:val="7"/>
   </w:num>
   <w:num w:numId="58" w16cid:durableId="1021475894">
-    <w:abstractNumId w:val="55"/>
+    <w:abstractNumId w:val="58"/>
   </w:num>
   <w:num w:numId="59" w16cid:durableId="1628202488">
     <w:abstractNumId w:val="13"/>
+  </w:num>
+  <w:num w:numId="60" w16cid:durableId="1033115596">
+    <w:abstractNumId w:val="26"/>
+  </w:num>
+  <w:num w:numId="61" w16cid:durableId="1298101617">
+    <w:abstractNumId w:val="14"/>
+  </w:num>
+  <w:num w:numId="62" w16cid:durableId="1711566099">
+    <w:abstractNumId w:val="32"/>
   </w:num>
   <w:numIdMacAtCleanup w:val="58"/>
 </w:numbering>
@@ -19723,7 +20599,6 @@
   <w:style w:type="character" w:default="1" w:styleId="Fuentedeprrafopredeter">
     <w:name w:val="Default Paragraph Font"/>
     <w:uiPriority w:val="1"/>
-    <w:semiHidden/>
     <w:unhideWhenUsed/>
   </w:style>
   <w:style w:type="table" w:default="1" w:styleId="Tablanormal">

</xml_diff>